<commit_message>
docs: add Claude session onboarding prompt to project tracker
Embeds a copy-paste prompt in the canonical state doc so both Mike
and Chris can bootstrap fresh Claude sessions with consistent context.
Updates regenerator to preserve the section on future runs.

Co-Authored-By: Claude Opus 4.7 (1M context) <noreply@anthropic.com>
</commit_message>
<xml_diff>
--- a/docs/Project_State_Tracker.docx
+++ b/docs/Project_State_Tracker.docx
@@ -1227,6 +1227,702 @@
         </w:tc>
       </w:tr>
     </w:tbl>
+    <w:p>
+      <w:pPr>
+        <w:pStyle w:val="Heading1"/>
+      </w:pPr>
+      <w:r>
+        <w:t>Claude Session Onboarding</w:t>
+      </w:r>
+    </w:p>
+    <w:p>
+      <w:r>
+        <w:rPr>
+          <w:rFonts w:ascii="Arial" w:hAnsi="Arial"/>
+          <w:b w:val="0"/>
+          <w:i w:val="0"/>
+          <w:sz w:val="22"/>
+        </w:rPr>
+        <w:t>When opening a new Claude.ai or Claude Code session about this project, paste the prompt below into the first message. This gives Claude immediate context on project state, recent decisions, and what's in flight — so the session doesn't waste turns asking what the project is or rediscovering things this tracker already documents.</w:t>
+      </w:r>
+    </w:p>
+    <w:tbl>
+      <w:tblPr>
+        <w:tblW w:type="auto" w:w="0"/>
+        <w:tblLayout w:type="autofit"/>
+        <w:tblLook w:firstColumn="1" w:firstRow="1" w:lastColumn="0" w:lastRow="0" w:noHBand="0" w:noVBand="1" w:val="04A0"/>
+      </w:tblPr>
+      <w:tblGrid>
+        <w:gridCol w:w="9360"/>
+      </w:tblGrid>
+      <w:tr>
+        <w:tc>
+          <w:tcPr>
+            <w:tcW w:type="dxa" w:w="9360"/>
+            <w:shd w:val="clear" w:color="auto" w:fill="F5F5F5"/>
+          </w:tcPr>
+          <w:p>
+            <w:pPr>
+              <w:spacing w:after="0" w:before="0"/>
+            </w:pPr>
+            <w:r>
+              <w:rPr>
+                <w:rFonts w:ascii="Consolas" w:hAnsi="Consolas"/>
+                <w:sz w:val="18"/>
+              </w:rPr>
+              <w:t>I'm working on a quant equity / options paper trading project at</w:t>
+            </w:r>
+          </w:p>
+          <w:p>
+            <w:pPr>
+              <w:spacing w:after="0" w:before="0"/>
+            </w:pPr>
+            <w:r>
+              <w:rPr>
+                <w:rFonts w:ascii="Consolas" w:hAnsi="Consolas"/>
+                <w:sz w:val="18"/>
+              </w:rPr>
+              <w:t>github.com/mteevan90/paper_trader_dashboard. Two contributors: Mike</w:t>
+            </w:r>
+          </w:p>
+          <w:p>
+            <w:pPr>
+              <w:spacing w:after="0" w:before="0"/>
+            </w:pPr>
+            <w:r>
+              <w:rPr>
+                <w:rFonts w:ascii="Consolas" w:hAnsi="Consolas"/>
+                <w:sz w:val="18"/>
+              </w:rPr>
+              <w:t>(equity research; account @mteevan90) and Chris (options + paused</w:t>
+            </w:r>
+          </w:p>
+          <w:p>
+            <w:pPr>
+              <w:spacing w:after="0" w:before="0"/>
+            </w:pPr>
+            <w:r>
+              <w:rPr>
+                <w:rFonts w:ascii="Consolas" w:hAnsi="Consolas"/>
+                <w:sz w:val="18"/>
+              </w:rPr>
+              <w:t>crypto; @cmjteevan).</w:t>
+            </w:r>
+          </w:p>
+          <w:p>
+            <w:pPr>
+              <w:spacing w:after="0" w:before="0"/>
+            </w:pPr>
+            <w:r>
+              <w:rPr>
+                <w:rFonts w:ascii="Consolas" w:hAnsi="Consolas"/>
+                <w:sz w:val="18"/>
+              </w:rPr>
+              <w:t xml:space="preserve"> </w:t>
+            </w:r>
+          </w:p>
+          <w:p>
+            <w:pPr>
+              <w:spacing w:after="0" w:before="0"/>
+            </w:pPr>
+            <w:r>
+              <w:rPr>
+                <w:rFonts w:ascii="Consolas" w:hAnsi="Consolas"/>
+                <w:sz w:val="18"/>
+              </w:rPr>
+              <w:t>Before answering my first question, please read these in order:</w:t>
+            </w:r>
+          </w:p>
+          <w:p>
+            <w:pPr>
+              <w:spacing w:after="0" w:before="0"/>
+            </w:pPr>
+            <w:r>
+              <w:rPr>
+                <w:rFonts w:ascii="Consolas" w:hAnsi="Consolas"/>
+                <w:sz w:val="18"/>
+              </w:rPr>
+              <w:t xml:space="preserve"> </w:t>
+            </w:r>
+          </w:p>
+          <w:p>
+            <w:pPr>
+              <w:spacing w:after="0" w:before="0"/>
+            </w:pPr>
+            <w:r>
+              <w:rPr>
+                <w:rFonts w:ascii="Consolas" w:hAnsi="Consolas"/>
+                <w:sz w:val="18"/>
+              </w:rPr>
+              <w:t>1. docs/Project_State_Tracker.docx — canonical current state, action</w:t>
+            </w:r>
+          </w:p>
+          <w:p>
+            <w:pPr>
+              <w:spacing w:after="0" w:before="0"/>
+            </w:pPr>
+            <w:r>
+              <w:rPr>
+                <w:rFonts w:ascii="Consolas" w:hAnsi="Consolas"/>
+                <w:sz w:val="18"/>
+              </w:rPr>
+              <w:t xml:space="preserve">   items, strategic context. THIS is your primary orientation doc.</w:t>
+            </w:r>
+          </w:p>
+          <w:p>
+            <w:pPr>
+              <w:spacing w:after="0" w:before="0"/>
+            </w:pPr>
+            <w:r>
+              <w:rPr>
+                <w:rFonts w:ascii="Consolas" w:hAnsi="Consolas"/>
+                <w:sz w:val="18"/>
+              </w:rPr>
+              <w:t xml:space="preserve"> </w:t>
+            </w:r>
+          </w:p>
+          <w:p>
+            <w:pPr>
+              <w:spacing w:after="0" w:before="0"/>
+            </w:pPr>
+            <w:r>
+              <w:rPr>
+                <w:rFonts w:ascii="Consolas" w:hAnsi="Consolas"/>
+                <w:sz w:val="18"/>
+              </w:rPr>
+              <w:t>2. docs/Comprehensive_User_Guide.docx — full technical reference</w:t>
+            </w:r>
+          </w:p>
+          <w:p>
+            <w:pPr>
+              <w:spacing w:after="0" w:before="0"/>
+            </w:pPr>
+            <w:r>
+              <w:rPr>
+                <w:rFonts w:ascii="Consolas" w:hAnsi="Consolas"/>
+                <w:sz w:val="18"/>
+              </w:rPr>
+              <w:t xml:space="preserve">   (architecture, data layer, dashboard patterns, gotchas). Reference</w:t>
+            </w:r>
+          </w:p>
+          <w:p>
+            <w:pPr>
+              <w:spacing w:after="0" w:before="0"/>
+            </w:pPr>
+            <w:r>
+              <w:rPr>
+                <w:rFonts w:ascii="Consolas" w:hAnsi="Consolas"/>
+                <w:sz w:val="18"/>
+              </w:rPr>
+              <w:t xml:space="preserve">   for depth.</w:t>
+            </w:r>
+          </w:p>
+          <w:p>
+            <w:pPr>
+              <w:spacing w:after="0" w:before="0"/>
+            </w:pPr>
+            <w:r>
+              <w:rPr>
+                <w:rFonts w:ascii="Consolas" w:hAnsi="Consolas"/>
+                <w:sz w:val="18"/>
+              </w:rPr>
+              <w:t xml:space="preserve"> </w:t>
+            </w:r>
+          </w:p>
+          <w:p>
+            <w:pPr>
+              <w:spacing w:after="0" w:before="0"/>
+            </w:pPr>
+            <w:r>
+              <w:rPr>
+                <w:rFonts w:ascii="Consolas" w:hAnsi="Consolas"/>
+                <w:sz w:val="18"/>
+              </w:rPr>
+              <w:t>3. docs/Project_State_Audit.docx — most recent audit from Claude Code</w:t>
+            </w:r>
+          </w:p>
+          <w:p>
+            <w:pPr>
+              <w:spacing w:after="0" w:before="0"/>
+            </w:pPr>
+            <w:r>
+              <w:rPr>
+                <w:rFonts w:ascii="Consolas" w:hAnsi="Consolas"/>
+                <w:sz w:val="18"/>
+              </w:rPr>
+              <w:t xml:space="preserve">   (2026-05-11), with file-level details on what's broken / stale /</w:t>
+            </w:r>
+          </w:p>
+          <w:p>
+            <w:pPr>
+              <w:spacing w:after="0" w:before="0"/>
+            </w:pPr>
+            <w:r>
+              <w:rPr>
+                <w:rFonts w:ascii="Consolas" w:hAnsi="Consolas"/>
+                <w:sz w:val="18"/>
+              </w:rPr>
+              <w:t xml:space="preserve">   clean.</w:t>
+            </w:r>
+          </w:p>
+          <w:p>
+            <w:pPr>
+              <w:spacing w:after="0" w:before="0"/>
+            </w:pPr>
+            <w:r>
+              <w:rPr>
+                <w:rFonts w:ascii="Consolas" w:hAnsi="Consolas"/>
+                <w:sz w:val="18"/>
+              </w:rPr>
+              <w:t xml:space="preserve"> </w:t>
+            </w:r>
+          </w:p>
+          <w:p>
+            <w:pPr>
+              <w:spacing w:after="0" w:before="0"/>
+            </w:pPr>
+            <w:r>
+              <w:rPr>
+                <w:rFonts w:ascii="Consolas" w:hAnsi="Consolas"/>
+                <w:sz w:val="18"/>
+              </w:rPr>
+              <w:t>4. docs/Options_Extension_Decisions.md — Chris's options architecture</w:t>
+            </w:r>
+          </w:p>
+          <w:p>
+            <w:pPr>
+              <w:spacing w:after="0" w:before="0"/>
+            </w:pPr>
+            <w:r>
+              <w:rPr>
+                <w:rFonts w:ascii="Consolas" w:hAnsi="Consolas"/>
+                <w:sz w:val="18"/>
+              </w:rPr>
+              <w:t xml:space="preserve">   decisions.</w:t>
+            </w:r>
+          </w:p>
+          <w:p>
+            <w:pPr>
+              <w:spacing w:after="0" w:before="0"/>
+            </w:pPr>
+            <w:r>
+              <w:rPr>
+                <w:rFonts w:ascii="Consolas" w:hAnsi="Consolas"/>
+                <w:sz w:val="18"/>
+              </w:rPr>
+              <w:t xml:space="preserve"> </w:t>
+            </w:r>
+          </w:p>
+          <w:p>
+            <w:pPr>
+              <w:spacing w:after="0" w:before="0"/>
+            </w:pPr>
+            <w:r>
+              <w:rPr>
+                <w:rFonts w:ascii="Consolas" w:hAnsi="Consolas"/>
+                <w:sz w:val="18"/>
+              </w:rPr>
+              <w:t>5. docs/Crypto_Extension_Decisions.md — Crypto extension architectural</w:t>
+            </w:r>
+          </w:p>
+          <w:p>
+            <w:pPr>
+              <w:spacing w:after="0" w:before="0"/>
+            </w:pPr>
+            <w:r>
+              <w:rPr>
+                <w:rFonts w:ascii="Consolas" w:hAnsi="Consolas"/>
+                <w:sz w:val="18"/>
+              </w:rPr>
+              <w:t xml:space="preserve">   decisions (extension is paused but doc is authoritative if work</w:t>
+            </w:r>
+          </w:p>
+          <w:p>
+            <w:pPr>
+              <w:spacing w:after="0" w:before="0"/>
+            </w:pPr>
+            <w:r>
+              <w:rPr>
+                <w:rFonts w:ascii="Consolas" w:hAnsi="Consolas"/>
+                <w:sz w:val="18"/>
+              </w:rPr>
+              <w:t xml:space="preserve">   resumes).</w:t>
+            </w:r>
+          </w:p>
+          <w:p>
+            <w:pPr>
+              <w:spacing w:after="0" w:before="0"/>
+            </w:pPr>
+            <w:r>
+              <w:rPr>
+                <w:rFonts w:ascii="Consolas" w:hAnsi="Consolas"/>
+                <w:sz w:val="18"/>
+              </w:rPr>
+              <w:t xml:space="preserve"> </w:t>
+            </w:r>
+          </w:p>
+          <w:p>
+            <w:pPr>
+              <w:spacing w:after="0" w:before="0"/>
+            </w:pPr>
+            <w:r>
+              <w:rPr>
+                <w:rFonts w:ascii="Consolas" w:hAnsi="Consolas"/>
+                <w:sz w:val="18"/>
+              </w:rPr>
+              <w:t>6. docs/future_work.md — deferred items, including hardware-aware work</w:t>
+            </w:r>
+          </w:p>
+          <w:p>
+            <w:pPr>
+              <w:spacing w:after="0" w:before="0"/>
+            </w:pPr>
+            <w:r>
+              <w:rPr>
+                <w:rFonts w:ascii="Consolas" w:hAnsi="Consolas"/>
+                <w:sz w:val="18"/>
+              </w:rPr>
+              <w:t xml:space="preserve">   allocation and distributed Optuna trigger.</w:t>
+            </w:r>
+          </w:p>
+          <w:p>
+            <w:pPr>
+              <w:spacing w:after="0" w:before="0"/>
+            </w:pPr>
+            <w:r>
+              <w:rPr>
+                <w:rFonts w:ascii="Consolas" w:hAnsi="Consolas"/>
+                <w:sz w:val="18"/>
+              </w:rPr>
+              <w:t xml:space="preserve"> </w:t>
+            </w:r>
+          </w:p>
+          <w:p>
+            <w:pPr>
+              <w:spacing w:after="0" w:before="0"/>
+            </w:pPr>
+            <w:r>
+              <w:rPr>
+                <w:rFonts w:ascii="Consolas" w:hAnsi="Consolas"/>
+                <w:sz w:val="18"/>
+              </w:rPr>
+              <w:t>Once you've read these, give me a 3-sentence summary of where the</w:t>
+            </w:r>
+          </w:p>
+          <w:p>
+            <w:pPr>
+              <w:spacing w:after="0" w:before="0"/>
+            </w:pPr>
+            <w:r>
+              <w:rPr>
+                <w:rFonts w:ascii="Consolas" w:hAnsi="Consolas"/>
+                <w:sz w:val="18"/>
+              </w:rPr>
+              <w:t>project stands and what URGENT items remain, then ask what I want to</w:t>
+            </w:r>
+          </w:p>
+          <w:p>
+            <w:pPr>
+              <w:spacing w:after="0" w:before="0"/>
+            </w:pPr>
+            <w:r>
+              <w:rPr>
+                <w:rFonts w:ascii="Consolas" w:hAnsi="Consolas"/>
+                <w:sz w:val="18"/>
+              </w:rPr>
+              <w:t>work on. Don't write any code or run any tools until I respond. Don't</w:t>
+            </w:r>
+          </w:p>
+          <w:p>
+            <w:pPr>
+              <w:spacing w:after="0" w:before="0"/>
+            </w:pPr>
+            <w:r>
+              <w:rPr>
+                <w:rFonts w:ascii="Consolas" w:hAnsi="Consolas"/>
+                <w:sz w:val="18"/>
+              </w:rPr>
+              <w:t>make assumptions about my role (Mike or Chris) — ask if it's not</w:t>
+            </w:r>
+          </w:p>
+          <w:p>
+            <w:pPr>
+              <w:spacing w:after="0" w:before="0"/>
+            </w:pPr>
+            <w:r>
+              <w:rPr>
+                <w:rFonts w:ascii="Consolas" w:hAnsi="Consolas"/>
+                <w:sz w:val="18"/>
+              </w:rPr>
+              <w:t>clear from context.</w:t>
+            </w:r>
+          </w:p>
+          <w:p>
+            <w:pPr>
+              <w:spacing w:after="0" w:before="0"/>
+            </w:pPr>
+            <w:r>
+              <w:rPr>
+                <w:rFonts w:ascii="Consolas" w:hAnsi="Consolas"/>
+                <w:sz w:val="18"/>
+              </w:rPr>
+              <w:t xml:space="preserve"> </w:t>
+            </w:r>
+          </w:p>
+          <w:p>
+            <w:pPr>
+              <w:spacing w:after="0" w:before="0"/>
+            </w:pPr>
+            <w:r>
+              <w:rPr>
+                <w:rFonts w:ascii="Consolas" w:hAnsi="Consolas"/>
+                <w:sz w:val="18"/>
+              </w:rPr>
+              <w:t>Key project conventions to absorb:</w:t>
+            </w:r>
+          </w:p>
+          <w:p>
+            <w:pPr>
+              <w:spacing w:after="0" w:before="0"/>
+            </w:pPr>
+            <w:r>
+              <w:rPr>
+                <w:rFonts w:ascii="Consolas" w:hAnsi="Consolas"/>
+                <w:sz w:val="18"/>
+              </w:rPr>
+              <w:t>- Mike owns equity work + shared infrastructure</w:t>
+            </w:r>
+          </w:p>
+          <w:p>
+            <w:pPr>
+              <w:spacing w:after="0" w:before="0"/>
+            </w:pPr>
+            <w:r>
+              <w:rPr>
+                <w:rFonts w:ascii="Consolas" w:hAnsi="Consolas"/>
+                <w:sz w:val="18"/>
+              </w:rPr>
+              <w:t>- Chris owns options + crypto code</w:t>
+            </w:r>
+          </w:p>
+          <w:p>
+            <w:pPr>
+              <w:spacing w:after="0" w:before="0"/>
+            </w:pPr>
+            <w:r>
+              <w:rPr>
+                <w:rFonts w:ascii="Consolas" w:hAnsi="Consolas"/>
+                <w:sz w:val="18"/>
+              </w:rPr>
+              <w:t>- CODEOWNERS in .github/ enforces cross-namespace boundaries</w:t>
+            </w:r>
+          </w:p>
+          <w:p>
+            <w:pPr>
+              <w:spacing w:after="0" w:before="0"/>
+            </w:pPr>
+            <w:r>
+              <w:rPr>
+                <w:rFonts w:ascii="Consolas" w:hAnsi="Consolas"/>
+                <w:sz w:val="18"/>
+              </w:rPr>
+              <w:t>- Cloud dashboard at paper-trader-mteev.streamlit.app (read-only,</w:t>
+            </w:r>
+          </w:p>
+          <w:p>
+            <w:pPr>
+              <w:spacing w:after="0" w:before="0"/>
+            </w:pPr>
+            <w:r>
+              <w:rPr>
+                <w:rFonts w:ascii="Consolas" w:hAnsi="Consolas"/>
+                <w:sz w:val="18"/>
+              </w:rPr>
+              <w:t xml:space="preserve">  R2-backed)</w:t>
+            </w:r>
+          </w:p>
+          <w:p>
+            <w:pPr>
+              <w:spacing w:after="0" w:before="0"/>
+            </w:pPr>
+            <w:r>
+              <w:rPr>
+                <w:rFonts w:ascii="Consolas" w:hAnsi="Consolas"/>
+                <w:sz w:val="18"/>
+              </w:rPr>
+              <w:t>- Asset-class-namespaced data layer: equities/, crypto/, options/</w:t>
+            </w:r>
+          </w:p>
+          <w:p>
+            <w:pPr>
+              <w:spacing w:after="0" w:before="0"/>
+            </w:pPr>
+            <w:r>
+              <w:rPr>
+                <w:rFonts w:ascii="Consolas" w:hAnsi="Consolas"/>
+                <w:sz w:val="18"/>
+              </w:rPr>
+              <w:t xml:space="preserve">  subdirs under models/cache/ and models/snapshots/</w:t>
+            </w:r>
+          </w:p>
+          <w:p>
+            <w:pPr>
+              <w:spacing w:after="0" w:before="0"/>
+            </w:pPr>
+            <w:r>
+              <w:rPr>
+                <w:rFonts w:ascii="Consolas" w:hAnsi="Consolas"/>
+                <w:sz w:val="18"/>
+              </w:rPr>
+              <w:t>- The tracker doc supersedes prior versions of any other handoff doc</w:t>
+            </w:r>
+          </w:p>
+          <w:p>
+            <w:pPr>
+              <w:spacing w:after="0" w:before="0"/>
+            </w:pPr>
+            <w:r>
+              <w:rPr>
+                <w:rFonts w:ascii="Consolas" w:hAnsi="Consolas"/>
+                <w:sz w:val="18"/>
+              </w:rPr>
+              <w:t xml:space="preserve"> </w:t>
+            </w:r>
+          </w:p>
+          <w:p>
+            <w:pPr>
+              <w:spacing w:after="0" w:before="0"/>
+            </w:pPr>
+            <w:r>
+              <w:rPr>
+                <w:rFonts w:ascii="Consolas" w:hAnsi="Consolas"/>
+                <w:sz w:val="18"/>
+              </w:rPr>
+              <w:t>Three things you should specifically NOT do without explicit</w:t>
+            </w:r>
+          </w:p>
+          <w:p>
+            <w:pPr>
+              <w:spacing w:after="0" w:before="0"/>
+            </w:pPr>
+            <w:r>
+              <w:rPr>
+                <w:rFonts w:ascii="Consolas" w:hAnsi="Consolas"/>
+                <w:sz w:val="18"/>
+              </w:rPr>
+              <w:t>confirmation:</w:t>
+            </w:r>
+          </w:p>
+          <w:p>
+            <w:pPr>
+              <w:spacing w:after="0" w:before="0"/>
+            </w:pPr>
+            <w:r>
+              <w:rPr>
+                <w:rFonts w:ascii="Consolas" w:hAnsi="Consolas"/>
+                <w:sz w:val="18"/>
+              </w:rPr>
+              <w:t>- Don't push to main (use feature branches; let me merge via PR)</w:t>
+            </w:r>
+          </w:p>
+          <w:p>
+            <w:pPr>
+              <w:spacing w:after="0" w:before="0"/>
+            </w:pPr>
+            <w:r>
+              <w:rPr>
+                <w:rFonts w:ascii="Consolas" w:hAnsi="Consolas"/>
+                <w:sz w:val="18"/>
+              </w:rPr>
+              <w:t>- Don't run snapshot_for_cloud.py without --dry-run first</w:t>
+            </w:r>
+          </w:p>
+          <w:p>
+            <w:pPr>
+              <w:spacing w:after="0" w:before="0"/>
+            </w:pPr>
+            <w:r>
+              <w:rPr>
+                <w:rFonts w:ascii="Consolas" w:hAnsi="Consolas"/>
+                <w:sz w:val="18"/>
+              </w:rPr>
+              <w:t>- Don't pop or modify stash@{0} (deferred SP1500 work)</w:t>
+            </w:r>
+          </w:p>
+          <w:p>
+            <w:pPr>
+              <w:spacing w:after="0" w:before="0"/>
+            </w:pPr>
+            <w:r>
+              <w:rPr>
+                <w:rFonts w:ascii="Consolas" w:hAnsi="Consolas"/>
+                <w:sz w:val="18"/>
+              </w:rPr>
+              <w:t xml:space="preserve"> </w:t>
+            </w:r>
+          </w:p>
+          <w:p>
+            <w:pPr>
+              <w:spacing w:after="0" w:before="0"/>
+            </w:pPr>
+            <w:r>
+              <w:rPr>
+                <w:rFonts w:ascii="Consolas" w:hAnsi="Consolas"/>
+                <w:sz w:val="18"/>
+              </w:rPr>
+              <w:t>If you find yourself working without having read the tracker doc</w:t>
+            </w:r>
+          </w:p>
+          <w:p>
+            <w:pPr>
+              <w:spacing w:after="0" w:before="0"/>
+            </w:pPr>
+            <w:r>
+              <w:rPr>
+                <w:rFonts w:ascii="Consolas" w:hAnsi="Consolas"/>
+                <w:sz w:val="18"/>
+              </w:rPr>
+              <w:t>first, stop and read it. The tracker is updated when project state</w:t>
+            </w:r>
+          </w:p>
+          <w:p>
+            <w:pPr>
+              <w:spacing w:after="0" w:before="0"/>
+            </w:pPr>
+            <w:r>
+              <w:rPr>
+                <w:rFonts w:ascii="Consolas" w:hAnsi="Consolas"/>
+                <w:sz w:val="18"/>
+              </w:rPr>
+              <w:t>changes meaningfully — its commit date in git log tells you how</w:t>
+            </w:r>
+          </w:p>
+          <w:p>
+            <w:pPr>
+              <w:spacing w:after="0" w:before="0"/>
+            </w:pPr>
+            <w:r>
+              <w:rPr>
+                <w:rFonts w:ascii="Consolas" w:hAnsi="Consolas"/>
+                <w:sz w:val="18"/>
+              </w:rPr>
+              <w:t>recently.</w:t>
+            </w:r>
+          </w:p>
+        </w:tc>
+      </w:tr>
+    </w:tbl>
+    <w:p>
+      <w:r>
+        <w:rPr>
+          <w:rFonts w:ascii="Arial" w:hAnsi="Arial"/>
+          <w:b w:val="0"/>
+          <w:i/>
+          <w:sz w:val="20"/>
+        </w:rPr>
+        <w:t>After pasting, Claude will read this tracker and any referenced docs before answering your first question. Update this prompt's reference list if you add new authoritative docs to the repo.</w:t>
+      </w:r>
+    </w:p>
     <w:p>
       <w:pPr>
         <w:pStyle w:val="Heading1"/>
@@ -4730,6 +5426,62 @@
       </w:r>
     </w:p>
     <w:p>
+      <w:r>
+        <w:rPr>
+          <w:rFonts w:ascii="Arial" w:hAnsi="Arial"/>
+          <w:b/>
+          <w:i w:val="0"/>
+          <w:sz w:val="22"/>
+        </w:rPr>
+        <w:t xml:space="preserve">Maintenance: </w:t>
+      </w:r>
+      <w:r>
+        <w:rPr>
+          <w:rFonts w:ascii="Arial" w:hAnsi="Arial"/>
+          <w:b w:val="0"/>
+          <w:i w:val="0"/>
+          <w:sz w:val="22"/>
+        </w:rPr>
+        <w:t>when adding new authoritative docs to docs/, update the "Claude Session Onboarding" prompt above to reference them. When contributor roles or conventions change, update the prompt's conventions section. Specifically, review the embedded prompt whenever:</w:t>
+      </w:r>
+    </w:p>
+    <w:p>
+      <w:pPr>
+        <w:pStyle w:val="ListBullet"/>
+      </w:pPr>
+      <w:r>
+        <w:rPr>
+          <w:rFonts w:ascii="Arial" w:hAnsi="Arial"/>
+          <w:sz w:val="22"/>
+        </w:rPr>
+        <w:t>Major docs are added to or removed from the reading list</w:t>
+      </w:r>
+    </w:p>
+    <w:p>
+      <w:pPr>
+        <w:pStyle w:val="ListBullet"/>
+      </w:pPr>
+      <w:r>
+        <w:rPr>
+          <w:rFonts w:ascii="Arial" w:hAnsi="Arial"/>
+          <w:sz w:val="22"/>
+        </w:rPr>
+        <w:t>Project conventions change (data layout, branching, deployment targets)</w:t>
+      </w:r>
+    </w:p>
+    <w:p>
+      <w:pPr>
+        <w:pStyle w:val="ListBullet"/>
+      </w:pPr>
+      <w:r>
+        <w:rPr>
+          <w:rFonts w:ascii="Arial" w:hAnsi="Arial"/>
+          <w:sz w:val="22"/>
+        </w:rPr>
+        <w:t>Contributor roles shift (ownership, handoffs, namespace boundaries)</w:t>
+      </w:r>
+    </w:p>
+    <w:p>
       <w:pPr>
         <w:pStyle w:val="Heading1"/>
       </w:pPr>

</xml_diff>

<commit_message>
docs: post-PR-15 refresh + complete .env.example + parity goal
PR #15 merged (993527f), equity R2 synced, test infrastructure fixed,
venv healthy. URGENT action items cleared from tracker.

.env.example now documents every environment variable the codebase
requires (POLYGON_API_KEY was missing; full enumeration added). This
unblocks Phase 1 of workstation parity goal — both contributors can
now stand up a complete .env from the template.

Adds workstation parity goal to future_work.md as a multi-phase plan
toward either-machine-can-pick-up-the-other's-work.

Co-Authored-By: Claude Opus 4.7 (1M context) <noreply@anthropic.com>
</commit_message>
<xml_diff>
--- a/docs/Project_State_Tracker.docx
+++ b/docs/Project_State_Tracker.docx
@@ -21,7 +21,7 @@
           <w:i/>
           <w:sz w:val="20"/>
         </w:rPr>
-        <w:t>Canonical project-state doc. Built from the Claude Code audit (2026-05-11) plus strategic context — Polygon piggyback analysis, prioritization framing, and cleanup commit summary. Lives at docs/Project_State_Tracker.docx; update via Claude Code when state changes meaningfully.</w:t>
+        <w:t>Canonical project-state doc. Built from the Claude Code audit (2026-05-11) plus strategic context — Polygon piggyback analysis, prioritization framing, cleanup commit summary, and the post-PR-#15-merge refresh. Lives at docs/Project_State_Tracker.docx; update via Claude Code when state changes meaningfully.</w:t>
       </w:r>
     </w:p>
     <w:p>
@@ -40,7 +40,7 @@
           <w:i w:val="0"/>
           <w:sz w:val="22"/>
         </w:rPr>
-        <w:t>Where the project actually stands as of May 11, 2026 (post-cleanup):</w:t>
+        <w:t>Where the project actually stands as of May 11, 2026 (post-PR-#15-merge):</w:t>
       </w:r>
     </w:p>
     <w:p>
@@ -109,7 +109,7 @@
           <w:i w:val="0"/>
           <w:sz w:val="22"/>
         </w:rPr>
-        <w:t xml:space="preserve"> Chris shipped Sections 1-8 + 2.5 to main over 2 days. PR #15 (hang fix + concurrency refactor) is open and blocks the v1 production study from running.</w:t>
+        <w:t xml:space="preserve"> Chris shipped Sections 1-8 + 2.5 to main over 2 days. PR #15 (hang fix + concurrency refactor) merged 2026-05-11 (commit 993527f); v1 production study is now ready to run and is pending Chris's launch.</w:t>
       </w:r>
     </w:p>
     <w:p>
@@ -123,7 +123,7 @@
           <w:i w:val="0"/>
           <w:sz w:val="22"/>
         </w:rPr>
-        <w:t>Cloud dashboard renders equity content correctly but R2 is stale.</w:t>
+        <w:t>Cloud dashboard equity content is current; options content is pending Chris's v1 study output.</w:t>
       </w:r>
       <w:r>
         <w:rPr>
@@ -132,7 +132,7 @@
           <w:i w:val="0"/>
           <w:sz w:val="22"/>
         </w:rPr>
-        <w:t xml:space="preserve"> Last upload 2026-05-09; main has advanced 13 commits since (all options). Options content has never been uploaded to R2.</w:t>
+        <w:t xml:space="preserve"> R2 synced 2026-05-11 at git_sha 993527f. The options/ prefix stays empty in R2 until the v1 study produces artifacts under models/cache/options/.</w:t>
       </w:r>
     </w:p>
     <w:p>
@@ -146,7 +146,7 @@
           <w:i w:val="0"/>
           <w:sz w:val="22"/>
         </w:rPr>
-        <w:t>Mike's venv is missing dependencies.</w:t>
+        <w:t>Mike's venv is healthy.</w:t>
       </w:r>
       <w:r>
         <w:rPr>
@@ -155,7 +155,30 @@
           <w:i w:val="0"/>
           <w:sz w:val="22"/>
         </w:rPr>
-        <w:t xml:space="preserve"> truststore and pytest aren't installed — both are in requirements.txt. One-command fix.</w:t>
+        <w:t xml:space="preserve"> Test collection bug fixed (commit c1346cd); truststore + pytest installed; full test suite runs.</w:t>
+      </w:r>
+    </w:p>
+    <w:p>
+      <w:pPr>
+        <w:pStyle w:val="ListBullet"/>
+      </w:pPr>
+      <w:r>
+        <w:rPr>
+          <w:rFonts w:ascii="Arial" w:hAnsi="Arial"/>
+          <w:b/>
+          <w:i w:val="0"/>
+          <w:sz w:val="22"/>
+        </w:rPr>
+        <w:t>.env.example now documents the full key set.</w:t>
+      </w:r>
+      <w:r>
+        <w:rPr>
+          <w:rFonts w:ascii="Arial" w:hAnsi="Arial"/>
+          <w:b w:val="0"/>
+          <w:i w:val="0"/>
+          <w:sz w:val="22"/>
+        </w:rPr>
+        <w:t xml:space="preserve"> Tradier, Polygon, FRED, Finnhub, R2, plus the optional PAPER_TRADER_* runtime knobs — see Finding 4.</w:t>
       </w:r>
     </w:p>
     <w:p>
@@ -198,7 +221,7 @@
           <w:i w:val="0"/>
           <w:sz w:val="22"/>
         </w:rPr>
-        <w:t>The project is in a much better technical state than it was 2 weeks ago. The mess is in coordination overhead — a stale R2, an open PR blocking a study, deferred decisions on infrastructure cleanup. The code itself is healthy. Three different research domains (equity, crypto, options) coexist without conflict thanks to Phase 1's asset-class refactor.</w:t>
+        <w:t>URGENT items are now cleared. PR #15 is merged, equity R2 is current, venv dependencies are installed, .env.example is complete. The next forcing function is Chris launching the v1 production study — once that completes, options content gets uploaded to R2 and we get the first end-to-end options-side dashboard. Three different research domains (equity, crypto, options) coexist without conflict thanks to Phase 1's asset-class refactor.</w:t>
       </w:r>
     </w:p>
     <w:p>
@@ -217,7 +240,7 @@
           <w:i/>
           <w:sz w:val="20"/>
         </w:rPr>
-        <w:t>Red rows are URGENT (blocking work); yellow rows are warnings (needs attention but not blocking); green rows are working as designed.</w:t>
+        <w:t>Red rows are URGENT (blocking work); yellow rows are warnings (needs attention but not blocking); green rows are working as designed. As of 2026-05-11 post-merge, no rows are red.</w:t>
       </w:r>
     </w:p>
     <w:tbl>
@@ -424,7 +447,7 @@
         <w:tc>
           <w:tcPr>
             <w:tcW w:type="dxa" w:w="2340"/>
-            <w:shd w:val="clear" w:color="auto" w:fill="FFF2CC"/>
+            <w:shd w:val="clear" w:color="auto" w:fill="D5E8D4"/>
             <w:tcBorders>
               <w:top w:val="single" w:sz="4" w:color="808080"/>
               <w:left w:val="single" w:sz="4" w:color="808080"/>
@@ -446,7 +469,7 @@
         <w:tc>
           <w:tcPr>
             <w:tcW w:type="dxa" w:w="2340"/>
-            <w:shd w:val="clear" w:color="auto" w:fill="FFF2CC"/>
+            <w:shd w:val="clear" w:color="auto" w:fill="D5E8D4"/>
             <w:tcBorders>
               <w:top w:val="single" w:sz="4" w:color="808080"/>
               <w:left w:val="single" w:sz="4" w:color="808080"/>
@@ -461,14 +484,14 @@
                 <w:rFonts w:ascii="Arial" w:hAnsi="Arial"/>
                 <w:sz w:val="18"/>
               </w:rPr>
-              <w:t>WORKING but R2 stale</w:t>
+              <w:t>WORKING — R2 current</w:t>
             </w:r>
           </w:p>
         </w:tc>
         <w:tc>
           <w:tcPr>
             <w:tcW w:type="dxa" w:w="2340"/>
-            <w:shd w:val="clear" w:color="auto" w:fill="FFF2CC"/>
+            <w:shd w:val="clear" w:color="auto" w:fill="D5E8D4"/>
             <w:tcBorders>
               <w:top w:val="single" w:sz="4" w:color="808080"/>
               <w:left w:val="single" w:sz="4" w:color="808080"/>
@@ -490,7 +513,7 @@
         <w:tc>
           <w:tcPr>
             <w:tcW w:type="dxa" w:w="2340"/>
-            <w:shd w:val="clear" w:color="auto" w:fill="FFF2CC"/>
+            <w:shd w:val="clear" w:color="auto" w:fill="D5E8D4"/>
             <w:tcBorders>
               <w:top w:val="single" w:sz="4" w:color="808080"/>
               <w:left w:val="single" w:sz="4" w:color="808080"/>
@@ -505,7 +528,7 @@
                 <w:rFonts w:ascii="Arial" w:hAnsi="Arial"/>
                 <w:sz w:val="18"/>
               </w:rPr>
-              <w:t>Sync R2 after PR #15 merges</w:t>
+              <w:t>Synced 2026-05-11 at git_sha 993527f</w:t>
             </w:r>
           </w:p>
         </w:tc>
@@ -604,7 +627,7 @@
         <w:tc>
           <w:tcPr>
             <w:tcW w:type="dxa" w:w="2340"/>
-            <w:shd w:val="clear" w:color="auto" w:fill="F4CCCC"/>
+            <w:shd w:val="clear" w:color="auto" w:fill="D5E8D4"/>
             <w:tcBorders>
               <w:top w:val="single" w:sz="4" w:color="808080"/>
               <w:left w:val="single" w:sz="4" w:color="808080"/>
@@ -626,7 +649,7 @@
         <w:tc>
           <w:tcPr>
             <w:tcW w:type="dxa" w:w="2340"/>
-            <w:shd w:val="clear" w:color="auto" w:fill="F4CCCC"/>
+            <w:shd w:val="clear" w:color="auto" w:fill="D5E8D4"/>
             <w:tcBorders>
               <w:top w:val="single" w:sz="4" w:color="808080"/>
               <w:left w:val="single" w:sz="4" w:color="808080"/>
@@ -641,14 +664,14 @@
                 <w:rFonts w:ascii="Arial" w:hAnsi="Arial"/>
                 <w:sz w:val="18"/>
               </w:rPr>
-              <w:t>OPEN — URGENT</w:t>
+              <w:t>MERGED</w:t>
             </w:r>
           </w:p>
         </w:tc>
         <w:tc>
           <w:tcPr>
             <w:tcW w:type="dxa" w:w="2340"/>
-            <w:shd w:val="clear" w:color="auto" w:fill="F4CCCC"/>
+            <w:shd w:val="clear" w:color="auto" w:fill="D5E8D4"/>
             <w:tcBorders>
               <w:top w:val="single" w:sz="4" w:color="808080"/>
               <w:left w:val="single" w:sz="4" w:color="808080"/>
@@ -670,7 +693,7 @@
         <w:tc>
           <w:tcPr>
             <w:tcW w:type="dxa" w:w="2340"/>
-            <w:shd w:val="clear" w:color="auto" w:fill="F4CCCC"/>
+            <w:shd w:val="clear" w:color="auto" w:fill="D5E8D4"/>
             <w:tcBorders>
               <w:top w:val="single" w:sz="4" w:color="808080"/>
               <w:left w:val="single" w:sz="4" w:color="808080"/>
@@ -685,7 +708,7 @@
                 <w:rFonts w:ascii="Arial" w:hAnsi="Arial"/>
                 <w:sz w:val="18"/>
               </w:rPr>
-              <w:t>Mike review + merge</w:t>
+              <w:t>Merged 2026-05-11; commit 993527f</w:t>
             </w:r>
           </w:p>
         </w:tc>
@@ -694,7 +717,7 @@
         <w:tc>
           <w:tcPr>
             <w:tcW w:type="dxa" w:w="2340"/>
-            <w:shd w:val="clear" w:color="auto" w:fill="F4CCCC"/>
+            <w:shd w:val="clear" w:color="auto" w:fill="FFF2CC"/>
             <w:tcBorders>
               <w:top w:val="single" w:sz="4" w:color="808080"/>
               <w:left w:val="single" w:sz="4" w:color="808080"/>
@@ -716,7 +739,7 @@
         <w:tc>
           <w:tcPr>
             <w:tcW w:type="dxa" w:w="2340"/>
-            <w:shd w:val="clear" w:color="auto" w:fill="F4CCCC"/>
+            <w:shd w:val="clear" w:color="auto" w:fill="FFF2CC"/>
             <w:tcBorders>
               <w:top w:val="single" w:sz="4" w:color="808080"/>
               <w:left w:val="single" w:sz="4" w:color="808080"/>
@@ -731,14 +754,14 @@
                 <w:rFonts w:ascii="Arial" w:hAnsi="Arial"/>
                 <w:sz w:val="18"/>
               </w:rPr>
-              <w:t>BLOCKED on PR #15</w:t>
+              <w:t>READY — pending Chris launch</w:t>
             </w:r>
           </w:p>
         </w:tc>
         <w:tc>
           <w:tcPr>
             <w:tcW w:type="dxa" w:w="2340"/>
-            <w:shd w:val="clear" w:color="auto" w:fill="F4CCCC"/>
+            <w:shd w:val="clear" w:color="auto" w:fill="FFF2CC"/>
             <w:tcBorders>
               <w:top w:val="single" w:sz="4" w:color="808080"/>
               <w:left w:val="single" w:sz="4" w:color="808080"/>
@@ -760,7 +783,7 @@
         <w:tc>
           <w:tcPr>
             <w:tcW w:type="dxa" w:w="2340"/>
-            <w:shd w:val="clear" w:color="auto" w:fill="F4CCCC"/>
+            <w:shd w:val="clear" w:color="auto" w:fill="FFF2CC"/>
             <w:tcBorders>
               <w:top w:val="single" w:sz="4" w:color="808080"/>
               <w:left w:val="single" w:sz="4" w:color="808080"/>
@@ -775,7 +798,7 @@
                 <w:rFonts w:ascii="Arial" w:hAnsi="Arial"/>
                 <w:sz w:val="18"/>
               </w:rPr>
-              <w:t>Cannot run until merge</w:t>
+              <w:t>Chris launches v1 production study</w:t>
             </w:r>
           </w:p>
         </w:tc>
@@ -1222,6 +1245,96 @@
                 <w:sz w:val="18"/>
               </w:rPr>
               <w:t>Commit 5c39cc5</w:t>
+            </w:r>
+          </w:p>
+        </w:tc>
+      </w:tr>
+      <w:tr>
+        <w:tc>
+          <w:tcPr>
+            <w:tcW w:type="dxa" w:w="2340"/>
+            <w:shd w:val="clear" w:color="auto" w:fill="FFF2CC"/>
+            <w:tcBorders>
+              <w:top w:val="single" w:sz="4" w:color="808080"/>
+              <w:left w:val="single" w:sz="4" w:color="808080"/>
+              <w:bottom w:val="single" w:sz="4" w:color="808080"/>
+              <w:right w:val="single" w:sz="4" w:color="808080"/>
+            </w:tcBorders>
+          </w:tcPr>
+          <w:p>
+            <w:r/>
+            <w:r>
+              <w:rPr>
+                <w:rFonts w:ascii="Arial" w:hAnsi="Arial"/>
+                <w:sz w:val="18"/>
+              </w:rPr>
+              <w:t>Options R2 sync</w:t>
+            </w:r>
+          </w:p>
+        </w:tc>
+        <w:tc>
+          <w:tcPr>
+            <w:tcW w:type="dxa" w:w="2340"/>
+            <w:shd w:val="clear" w:color="auto" w:fill="FFF2CC"/>
+            <w:tcBorders>
+              <w:top w:val="single" w:sz="4" w:color="808080"/>
+              <w:left w:val="single" w:sz="4" w:color="808080"/>
+              <w:bottom w:val="single" w:sz="4" w:color="808080"/>
+              <w:right w:val="single" w:sz="4" w:color="808080"/>
+            </w:tcBorders>
+          </w:tcPr>
+          <w:p>
+            <w:r/>
+            <w:r>
+              <w:rPr>
+                <w:rFonts w:ascii="Arial" w:hAnsi="Arial"/>
+                <w:sz w:val="18"/>
+              </w:rPr>
+              <w:t>PENDING — no v1 study output yet</w:t>
+            </w:r>
+          </w:p>
+        </w:tc>
+        <w:tc>
+          <w:tcPr>
+            <w:tcW w:type="dxa" w:w="2340"/>
+            <w:shd w:val="clear" w:color="auto" w:fill="FFF2CC"/>
+            <w:tcBorders>
+              <w:top w:val="single" w:sz="4" w:color="808080"/>
+              <w:left w:val="single" w:sz="4" w:color="808080"/>
+              <w:bottom w:val="single" w:sz="4" w:color="808080"/>
+              <w:right w:val="single" w:sz="4" w:color="808080"/>
+            </w:tcBorders>
+          </w:tcPr>
+          <w:p>
+            <w:r/>
+            <w:r>
+              <w:rPr>
+                <w:rFonts w:ascii="Arial" w:hAnsi="Arial"/>
+                <w:sz w:val="18"/>
+              </w:rPr>
+              <w:t>Chris</w:t>
+            </w:r>
+          </w:p>
+        </w:tc>
+        <w:tc>
+          <w:tcPr>
+            <w:tcW w:type="dxa" w:w="2340"/>
+            <w:shd w:val="clear" w:color="auto" w:fill="FFF2CC"/>
+            <w:tcBorders>
+              <w:top w:val="single" w:sz="4" w:color="808080"/>
+              <w:left w:val="single" w:sz="4" w:color="808080"/>
+              <w:bottom w:val="single" w:sz="4" w:color="808080"/>
+              <w:right w:val="single" w:sz="4" w:color="808080"/>
+            </w:tcBorders>
+          </w:tcPr>
+          <w:p>
+            <w:r/>
+            <w:r>
+              <w:rPr>
+                <w:rFonts w:ascii="Arial" w:hAnsi="Arial"/>
+                <w:sz w:val="18"/>
+              </w:rPr>
+              <w:t>Run v1 production study; that produces the artifacts snapshot_for_cloud.py expects under models/cache/options/</w:t>
             </w:r>
           </w:p>
         </w:tc>
@@ -1936,7 +2049,27 @@
         <w:pStyle w:val="Heading2"/>
       </w:pPr>
       <w:r>
-        <w:t>Finding 1: PR #15 blocks the options v1 study</w:t>
+        <w:t>Finding 1: PR #15 blocks the options v1 study — RESOLVED</w:t>
+      </w:r>
+    </w:p>
+    <w:p>
+      <w:r>
+        <w:rPr>
+          <w:rFonts w:ascii="Arial" w:hAnsi="Arial"/>
+          <w:b/>
+          <w:i w:val="0"/>
+          <w:sz w:val="22"/>
+        </w:rPr>
+        <w:t xml:space="preserve">Resolved 2026-05-11: </w:t>
+      </w:r>
+      <w:r>
+        <w:rPr>
+          <w:rFonts w:ascii="Arial" w:hAnsi="Arial"/>
+          <w:b w:val="0"/>
+          <w:i w:val="0"/>
+          <w:sz w:val="22"/>
+        </w:rPr>
+        <w:t>PR #15 merged at commit 993527f. Branch chris/options-fix-v1-study-hang folded into main; v1 study is now unblocked and pending Chris's launch.</w:t>
       </w:r>
     </w:p>
     <w:p>
@@ -1947,7 +2080,18 @@
           <w:i w:val="0"/>
           <w:sz w:val="22"/>
         </w:rPr>
-        <w:t>Branch chris/options-fix-v1-study-hang @ 7e0881c is 1 commit ahead of main. Real fix, not cosmetic. Root cause: engine.py was still passing Tradier's fetch_history to chain_reconstruction after PR #14 swapped the default to Polygon. Tradier returns null for expired OCCs, so reconstruct_chain looped on empty data.</w:t>
+        <w:t>Historical context — original finding kept for the record:</w:t>
+      </w:r>
+    </w:p>
+    <w:p>
+      <w:r>
+        <w:rPr>
+          <w:rFonts w:ascii="Arial" w:hAnsi="Arial"/>
+          <w:b w:val="0"/>
+          <w:i w:val="0"/>
+          <w:sz w:val="22"/>
+        </w:rPr>
+        <w:t>Branch chris/options-fix-v1-study-hang @ 7e0881c was 1 commit ahead of main. Real fix, not cosmetic. Root cause: engine.py was still passing Tradier's fetch_history to chain_reconstruction after PR #14 swapped the default to Polygon. Tradier returns null for expired OCCs, so reconstruct_chain looped on empty data.</w:t>
       </w:r>
     </w:p>
     <w:p>
@@ -2029,7 +2173,15 @@
           <w:i w:val="0"/>
           <w:sz w:val="22"/>
         </w:rPr>
-        <w:t>8 files, +526/-106 lines, new tests included. Impact: v1 production study cannot complete until this lands. No models/snapshots/options/pre_options_v1_&lt;date&gt;/ exists yet.</w:t>
+        <w:t>8 files, +526/-106 lines, new tests included.</w:t>
+      </w:r>
+    </w:p>
+    <w:p>
+      <w:pPr>
+        <w:pStyle w:val="Heading2"/>
+      </w:pPr>
+      <w:r>
+        <w:t>Finding 2: R2 stale — RESOLVED for equities; options pending Chris's v1 study</w:t>
       </w:r>
     </w:p>
     <w:p>
@@ -2040,7 +2192,7 @@
           <w:i w:val="0"/>
           <w:sz w:val="22"/>
         </w:rPr>
-        <w:t xml:space="preserve">Action: </w:t>
+        <w:t xml:space="preserve">Resolved 2026-05-11 (equities): </w:t>
       </w:r>
       <w:r>
         <w:rPr>
@@ -2049,15 +2201,7 @@
           <w:i w:val="0"/>
           <w:sz w:val="22"/>
         </w:rPr>
-        <w:t>Mike reviews the diff, merges via squash on GitHub. ~10 minutes.</w:t>
-      </w:r>
-    </w:p>
-    <w:p>
-      <w:pPr>
-        <w:pStyle w:val="Heading2"/>
-      </w:pPr>
-      <w:r>
-        <w:t>Finding 2: R2 is stale — main is 13 commits ahead of last upload</w:t>
+        <w:t>R2 synced at git_sha 993527f. Equity content on the cloud dashboard is current. Options content still pending — there is no v1 study output to upload yet, so the options/ prefix in R2 remains empty until Chris launches the v1 production study.</w:t>
       </w:r>
     </w:p>
     <w:p>
@@ -2068,7 +2212,26 @@
           <w:i w:val="0"/>
           <w:sz w:val="22"/>
         </w:rPr>
-        <w:t>R2 bucket snapshot_manifest.json says git_sha=bfee6dc, generated_at=2026-05-09T17:20:38Z. Main is at f3c3800. Functionally, equity content is still correct because none of those 13 commits touched equity files — they're all options work. But options content has never been uploaded to R2 at all (no options/ prefix exists in the bucket).</w:t>
+        <w:t>Historical context — original finding kept for the record:</w:t>
+      </w:r>
+    </w:p>
+    <w:p>
+      <w:r>
+        <w:rPr>
+          <w:rFonts w:ascii="Arial" w:hAnsi="Arial"/>
+          <w:b w:val="0"/>
+          <w:i w:val="0"/>
+          <w:sz w:val="22"/>
+        </w:rPr>
+        <w:t>R2 bucket snapshot_manifest.json had been at git_sha=bfee6dc, generated_at=2026-05-09T17:20:38Z while main had advanced to f3c3800. Functionally, equity content was still correct because none of those 13 commits touched equity files — they were all options work. But options content had never been uploaded to R2 at all.</w:t>
+      </w:r>
+    </w:p>
+    <w:p>
+      <w:pPr>
+        <w:pStyle w:val="Heading2"/>
+      </w:pPr>
+      <w:r>
+        <w:t>Finding 3: Mike's venv missing truststore and pytest — RESOLVED</w:t>
       </w:r>
     </w:p>
     <w:p>
@@ -2079,63 +2242,16 @@
           <w:i w:val="0"/>
           <w:sz w:val="22"/>
         </w:rPr>
-        <w:t>Action sequence:</w:t>
+        <w:t xml:space="preserve">Resolved 2026-05-11: </w:t>
       </w:r>
-    </w:p>
-    <w:p>
-      <w:pPr>
-        <w:pStyle w:val="ListBullet"/>
-      </w:pPr>
       <w:r>
         <w:rPr>
           <w:rFonts w:ascii="Arial" w:hAnsi="Arial"/>
+          <w:b w:val="0"/>
+          <w:i w:val="0"/>
           <w:sz w:val="22"/>
         </w:rPr>
-        <w:t>Merge PR #15</w:t>
-      </w:r>
-    </w:p>
-    <w:p>
-      <w:pPr>
-        <w:pStyle w:val="ListBullet"/>
-      </w:pPr>
-      <w:r>
-        <w:rPr>
-          <w:rFonts w:ascii="Arial" w:hAnsi="Arial"/>
-          <w:sz w:val="22"/>
-        </w:rPr>
-        <w:t>Run snapshot_for_cloud.py --asset-class equities (catches any equity changes — should be a near-no-op)</w:t>
-      </w:r>
-    </w:p>
-    <w:p>
-      <w:pPr>
-        <w:pStyle w:val="ListBullet"/>
-      </w:pPr>
-      <w:r>
-        <w:rPr>
-          <w:rFonts w:ascii="Arial" w:hAnsi="Arial"/>
-          <w:sz w:val="22"/>
-        </w:rPr>
-        <w:t>Run snapshot_for_cloud.py --asset-class options (first-ever options upload)</w:t>
-      </w:r>
-    </w:p>
-    <w:p>
-      <w:pPr>
-        <w:pStyle w:val="ListBullet"/>
-      </w:pPr>
-      <w:r>
-        <w:rPr>
-          <w:rFonts w:ascii="Arial" w:hAnsi="Arial"/>
-          <w:sz w:val="22"/>
-        </w:rPr>
-        <w:t>Hard-refresh the cloud dashboard, verify Options tab no longer shows placeholder</w:t>
-      </w:r>
-    </w:p>
-    <w:p>
-      <w:pPr>
-        <w:pStyle w:val="Heading2"/>
-      </w:pPr>
-      <w:r>
-        <w:t>Finding 3: Mike's venv is missing truststore and pytest</w:t>
+        <w:t>Test collection bug fixed in commit c1346cd; venv dependencies installed via pip install -r requirements.txt. Full test suite now collects and runs.</w:t>
       </w:r>
     </w:p>
     <w:p>
@@ -2146,7 +2262,18 @@
           <w:i w:val="0"/>
           <w:sz w:val="22"/>
         </w:rPr>
-        <w:t>truststore==0.10.4 is in requirements.txt but not installed. Two test failures, both same root cause:</w:t>
+        <w:t>Historical context — original finding kept for the record:</w:t>
+      </w:r>
+    </w:p>
+    <w:p>
+      <w:r>
+        <w:rPr>
+          <w:rFonts w:ascii="Arial" w:hAnsi="Arial"/>
+          <w:b w:val="0"/>
+          <w:i w:val="0"/>
+          <w:sz w:val="22"/>
+        </w:rPr>
+        <w:t>truststore==0.10.4 was in requirements.txt but not installed on Mike's machine. Two test failures, both same root cause:</w:t>
       </w:r>
     </w:p>
     <w:p>
@@ -2170,7 +2297,7 @@
           <w:rFonts w:ascii="Arial" w:hAnsi="Arial"/>
           <w:sz w:val="22"/>
         </w:rPr>
-        <w:t>test_optuna_runner.py::test_smoke_study_constants_match_locked_config: fails for the same reason transitively via src/options/_ssl.py</w:t>
+        <w:t>test_optuna_runner.py::test_smoke_study_constants_match_locked_config: failed for the same reason transitively via src/options/_ssl.py</w:t>
       </w:r>
     </w:p>
     <w:p>
@@ -2181,40 +2308,27 @@
           <w:i w:val="0"/>
           <w:sz w:val="22"/>
         </w:rPr>
-        <w:t>After fixing: 374 tests pass, 1 skipped. Fix is one command:</w:t>
+        <w:t>After fixing: 374 tests pass, 1 skipped. Also flagged at the time: pytest itself wasn't in requirements.txt at all. Add it as a dev dep so future fresh venvs are self-bootstrapping.</w:t>
       </w:r>
     </w:p>
-    <w:tbl>
-      <w:tblPr>
-        <w:tblW w:type="auto" w:w="0"/>
-        <w:tblLayout w:type="autofit"/>
-        <w:tblLook w:firstColumn="1" w:firstRow="1" w:lastColumn="0" w:lastRow="0" w:noHBand="0" w:noVBand="1" w:val="04A0"/>
-      </w:tblPr>
-      <w:tblGrid>
-        <w:gridCol w:w="9360"/>
-      </w:tblGrid>
-      <w:tr>
-        <w:tc>
-          <w:tcPr>
-            <w:tcW w:type="dxa" w:w="9360"/>
-            <w:shd w:val="clear" w:color="auto" w:fill="F2F2F2"/>
-          </w:tcPr>
-          <w:p>
-            <w:pPr>
-              <w:spacing w:after="0" w:before="0"/>
-            </w:pPr>
-            <w:r>
-              <w:rPr>
-                <w:rFonts w:ascii="Consolas" w:hAnsi="Consolas"/>
-                <w:sz w:val="18"/>
-              </w:rPr>
-              <w:t>venv\Scripts\pip install -r requirements.txt</w:t>
-            </w:r>
-          </w:p>
-        </w:tc>
-      </w:tr>
-    </w:tbl>
     <w:p>
+      <w:pPr>
+        <w:pStyle w:val="Heading2"/>
+      </w:pPr>
+      <w:r>
+        <w:t>Finding 4: .env.example missing POLYGON_API_KEY — RESOLVED</w:t>
+      </w:r>
+    </w:p>
+    <w:p>
+      <w:r>
+        <w:rPr>
+          <w:rFonts w:ascii="Arial" w:hAnsi="Arial"/>
+          <w:b/>
+          <w:i w:val="0"/>
+          <w:sz w:val="22"/>
+        </w:rPr>
+        <w:t xml:space="preserve">Resolved in this commit: </w:t>
+      </w:r>
       <w:r>
         <w:rPr>
           <w:rFonts w:ascii="Arial" w:hAnsi="Arial"/>
@@ -2222,15 +2336,7 @@
           <w:i w:val="0"/>
           <w:sz w:val="22"/>
         </w:rPr>
-        <w:t>Also flagged: pytest itself isn't in requirements.txt at all. Add it as a dev dep so future fresh venvs are self-bootstrapping.</w:t>
-      </w:r>
-    </w:p>
-    <w:p>
-      <w:pPr>
-        <w:pStyle w:val="Heading2"/>
-      </w:pPr>
-      <w:r>
-        <w:t>Finding 4: .env.example missing POLYGON_API_KEY — silent onboarding failure</w:t>
+        <w:t>.env.example now enumerates every environment variable the codebase reads at runtime (Tradier, Polygon, FRED, Finnhub, R2, and the optional PAPER_TRADER_* runtime knobs), grouped by purpose with signup links where relevant.</w:t>
       </w:r>
     </w:p>
     <w:p>
@@ -2241,19 +2347,10 @@
           <w:i w:val="0"/>
           <w:sz w:val="22"/>
         </w:rPr>
-        <w:t>src/options/polygon.py requires POLYGON_API_KEY and even cites Massive.com as the signup destination. But .env.example only documents Tradier env vars. A new contributor (or Mike on a fresh checkout) will hit a runtime error with no docs path forward.</w:t>
+        <w:t>Historical context — original finding kept for the record:</w:t>
       </w:r>
     </w:p>
     <w:p>
-      <w:r>
-        <w:rPr>
-          <w:rFonts w:ascii="Arial" w:hAnsi="Arial"/>
-          <w:b/>
-          <w:i w:val="0"/>
-          <w:sz w:val="22"/>
-        </w:rPr>
-        <w:t xml:space="preserve">Easy fix: </w:t>
-      </w:r>
       <w:r>
         <w:rPr>
           <w:rFonts w:ascii="Arial" w:hAnsi="Arial"/>
@@ -2261,7 +2358,7 @@
           <w:i w:val="0"/>
           <w:sz w:val="22"/>
         </w:rPr>
-        <w:t>add to .env.example with a comment linking to https://polygon.io/signup.</w:t>
+        <w:t>src/options/polygon.py required POLYGON_API_KEY and even cited Massive.com as the signup destination. But .env.example only documented Tradier env vars. A new contributor (or Mike on a fresh checkout) would have hit a runtime error with no docs path forward.</w:t>
       </w:r>
     </w:p>
     <w:p>
@@ -2438,18 +2535,6 @@
       </w:r>
     </w:p>
     <w:p>
-      <w:pPr>
-        <w:pStyle w:val="ListBullet"/>
-      </w:pPr>
-      <w:r>
-        <w:rPr>
-          <w:rFonts w:ascii="Arial" w:hAnsi="Arial"/>
-          <w:b/>
-          <w:i w:val="0"/>
-          <w:sz w:val="22"/>
-        </w:rPr>
-        <w:t>Merge PR #15.</w:t>
-      </w:r>
       <w:r>
         <w:rPr>
           <w:rFonts w:ascii="Arial" w:hAnsi="Arial"/>
@@ -2457,76 +2542,7 @@
           <w:i w:val="0"/>
           <w:sz w:val="22"/>
         </w:rPr>
-        <w:t xml:space="preserve"> Mike eyeballs the diff on GitHub, clicks Squash and Merge. ~10 min.</w:t>
-      </w:r>
-    </w:p>
-    <w:p>
-      <w:pPr>
-        <w:pStyle w:val="ListBullet"/>
-      </w:pPr>
-      <w:r>
-        <w:rPr>
-          <w:rFonts w:ascii="Arial" w:hAnsi="Arial"/>
-          <w:b/>
-          <w:i w:val="0"/>
-          <w:sz w:val="22"/>
-        </w:rPr>
-        <w:t>Run pip install -r requirements.txt.</w:t>
-      </w:r>
-      <w:r>
-        <w:rPr>
-          <w:rFonts w:ascii="Arial" w:hAnsi="Arial"/>
-          <w:b w:val="0"/>
-          <w:i w:val="0"/>
-          <w:sz w:val="22"/>
-        </w:rPr>
-        <w:t xml:space="preserve"> Fixes the 2 test failures and gets truststore. &lt;1 min.</w:t>
-      </w:r>
-    </w:p>
-    <w:p>
-      <w:pPr>
-        <w:pStyle w:val="ListBullet"/>
-      </w:pPr>
-      <w:r>
-        <w:rPr>
-          <w:rFonts w:ascii="Arial" w:hAnsi="Arial"/>
-          <w:b/>
-          <w:i w:val="0"/>
-          <w:sz w:val="22"/>
-        </w:rPr>
-        <w:t>Sync R2 with --asset-class equities and --asset-class options.</w:t>
-      </w:r>
-      <w:r>
-        <w:rPr>
-          <w:rFonts w:ascii="Arial" w:hAnsi="Arial"/>
-          <w:b w:val="0"/>
-          <w:i w:val="0"/>
-          <w:sz w:val="22"/>
-        </w:rPr>
-        <w:t xml:space="preserve"> Brings cloud dashboard current. ~5 min.</w:t>
-      </w:r>
-    </w:p>
-    <w:p>
-      <w:pPr>
-        <w:pStyle w:val="ListBullet"/>
-      </w:pPr>
-      <w:r>
-        <w:rPr>
-          <w:rFonts w:ascii="Arial" w:hAnsi="Arial"/>
-          <w:b/>
-          <w:i w:val="0"/>
-          <w:sz w:val="22"/>
-        </w:rPr>
-        <w:t>Visually verify the cloud dashboard.</w:t>
-      </w:r>
-      <w:r>
-        <w:rPr>
-          <w:rFonts w:ascii="Arial" w:hAnsi="Arial"/>
-          <w:b w:val="0"/>
-          <w:i w:val="0"/>
-          <w:sz w:val="22"/>
-        </w:rPr>
-        <w:t xml:space="preserve"> Hard-refresh paper-trader-mteev.streamlit.app, click each tab. Confirm no 404 errors. ~3 min.</w:t>
+        <w:t>URGENT items resolved 2026-05-11. Next URGENT item will surface when Chris runs the v1 study and we need to verify the options dashboard renders correctly.</w:t>
       </w:r>
     </w:p>
     <w:p>
@@ -2548,7 +2564,7 @@
           <w:i w:val="0"/>
           <w:sz w:val="22"/>
         </w:rPr>
-        <w:t>Add POLYGON_API_KEY to .env.example.</w:t>
+        <w:t>Sync .env between Mike and Chris's machines (one-time).</w:t>
       </w:r>
       <w:r>
         <w:rPr>
@@ -2557,7 +2573,53 @@
           <w:i w:val="0"/>
           <w:sz w:val="22"/>
         </w:rPr>
-        <w:t xml:space="preserve"> Trivial fix; eliminates silent onboarding failure. ~2 min.</w:t>
+        <w:t xml:space="preserve"> Out-of-band task. Both contributors need identical .env content so either workstation can run any task. .env.example in this commit enumerates the full key set — each contributor fills in their copy and shares it with the other via a secure channel.</w:t>
+      </w:r>
+    </w:p>
+    <w:p>
+      <w:pPr>
+        <w:pStyle w:val="ListBullet"/>
+      </w:pPr>
+      <w:r>
+        <w:rPr>
+          <w:rFonts w:ascii="Arial" w:hAnsi="Arial"/>
+          <w:b/>
+          <w:i w:val="0"/>
+          <w:sz w:val="22"/>
+        </w:rPr>
+        <w:t>Wait for Chris to run v1 study; then sync options R2.</w:t>
+      </w:r>
+      <w:r>
+        <w:rPr>
+          <w:rFonts w:ascii="Arial" w:hAnsi="Arial"/>
+          <w:b w:val="0"/>
+          <w:i w:val="0"/>
+          <w:sz w:val="22"/>
+        </w:rPr>
+        <w:t xml:space="preserve"> Once Chris launches and the v1 study produces models/cache/options/ artifacts, run snapshot_for_cloud.py --asset-class options to push them to R2.</w:t>
+      </w:r>
+    </w:p>
+    <w:p>
+      <w:pPr>
+        <w:pStyle w:val="ListBullet"/>
+      </w:pPr>
+      <w:r>
+        <w:rPr>
+          <w:rFonts w:ascii="Arial" w:hAnsi="Arial"/>
+          <w:b/>
+          <w:i w:val="0"/>
+          <w:sz w:val="22"/>
+        </w:rPr>
+        <w:t>Verify options dashboard end-to-end after R2 sync.</w:t>
+      </w:r>
+      <w:r>
+        <w:rPr>
+          <w:rFonts w:ascii="Arial" w:hAnsi="Arial"/>
+          <w:b w:val="0"/>
+          <w:i w:val="0"/>
+          <w:sz w:val="22"/>
+        </w:rPr>
+        <w:t xml:space="preserve"> Equity tabs already verified at git_sha 993527f. Options verification is pending Chris's v1 study + the subsequent options R2 sync.</w:t>
       </w:r>
     </w:p>
     <w:p>
@@ -3947,7 +4009,7 @@
           <w:i w:val="0"/>
           <w:sz w:val="22"/>
         </w:rPr>
-        <w:t>Beyond the immediate action items, three things about where the project is now:</w:t>
+        <w:t>Beyond the immediate action items, four things about where the project is now:</w:t>
       </w:r>
     </w:p>
     <w:p>
@@ -3985,7 +4047,7 @@
           <w:i w:val="0"/>
           <w:sz w:val="22"/>
         </w:rPr>
-        <w:t>Everything in the URGENT and HIGH action lists is coordination work — review a PR, sync R2, update docs, install deps. No deep technical work is currently blocked. That's a much better state than "we have a working strategy but the code is broken," which is where many quant projects get stuck.</w:t>
+        <w:t>Everything that remains on the HIGH action list is coordination work — launch a queued study, sync R2 once artifacts exist, share .env between machines, update stale memos. No deep technical work is currently blocked. That's a much better state than "we have a working strategy but the code is broken," which is where many quant projects get stuck.</w:t>
       </w:r>
     </w:p>
     <w:p>
@@ -4082,7 +4144,7 @@
           <w:i w:val="0"/>
           <w:sz w:val="22"/>
         </w:rPr>
-        <w:t>Chris shipped 13 commits in 2 days. That's a meaningful sprint and the audit shows the work is real — proper Greeks (Black-Scholes), engine, position model, BacktestConfig, FeeModel, Optuna runner, promotion gate, concentration analysis. The PR #15 hang fix is exactly the kind of bug that shows up when you actually try to run something end-to-end. Worth merging soon so he doesn't have to context-switch back to it later.</w:t>
+        <w:t>Chris shipped 13 commits in 2 days, with PR #15 landing the hang fix + concurrency refactor on 2026-05-11. The work is real — proper Greeks (Black-Scholes), engine, position model, BacktestConfig, FeeModel, Optuna runner, promotion gate, concentration analysis. The PR #15 hang fix was exactly the kind of bug that shows up when you actually try to run something end-to-end.</w:t>
       </w:r>
     </w:p>
     <w:p>
@@ -4093,7 +4155,85 @@
           <w:i w:val="0"/>
           <w:sz w:val="22"/>
         </w:rPr>
-        <w:t>Once PR #15 merges and the v1 study runs, you'll have a third promotable workstream alongside the three equity studies. The dashboard will need parallel options tabs eventually (or at least a Performance tab that handles both asset classes); that's a future-work item Chris should think about as he gets close to v1 promotion.</w:t>
+        <w:t>Now that PR #15 has merged, the v1 study is unblocked. Once Chris launches it and it completes, the project gets a third promotable workstream alongside the three equity studies. The dashboard will need parallel options tabs eventually (or at least a Performance tab that handles both asset classes); that's a future-work item Chris should think about as he gets close to v1 promotion.</w:t>
+      </w:r>
+    </w:p>
+    <w:p>
+      <w:pPr>
+        <w:pStyle w:val="Heading2"/>
+      </w:pPr>
+      <w:r>
+        <w:t>Workstation parity goal</w:t>
+      </w:r>
+    </w:p>
+    <w:p>
+      <w:r>
+        <w:rPr>
+          <w:rFonts w:ascii="Arial" w:hAnsi="Arial"/>
+          <w:b w:val="0"/>
+          <w:i w:val="0"/>
+          <w:sz w:val="22"/>
+        </w:rPr>
+        <w:t>Mike and Chris are working toward a two-workstation parity model — either machine should be capable of picking up tasks the other was doing. Most code is already portable thanks to the Phase 1 asset-class refactor. Remaining work to reach full parity:</w:t>
+      </w:r>
+    </w:p>
+    <w:p>
+      <w:pPr>
+        <w:pStyle w:val="ListBullet"/>
+      </w:pPr>
+      <w:r>
+        <w:rPr>
+          <w:rFonts w:ascii="Arial" w:hAnsi="Arial"/>
+          <w:sz w:val="22"/>
+        </w:rPr>
+        <w:t>Identical .env on both machines (done as of this commit — .env.example now enumerates the full key set)</w:t>
+      </w:r>
+    </w:p>
+    <w:p>
+      <w:pPr>
+        <w:pStyle w:val="ListBullet"/>
+      </w:pPr>
+      <w:r>
+        <w:rPr>
+          <w:rFonts w:ascii="Arial" w:hAnsi="Arial"/>
+          <w:sz w:val="22"/>
+        </w:rPr>
+        <w:t>Python version + venv package parity</w:t>
+      </w:r>
+    </w:p>
+    <w:p>
+      <w:pPr>
+        <w:pStyle w:val="ListBullet"/>
+      </w:pPr>
+      <w:r>
+        <w:rPr>
+          <w:rFonts w:ascii="Arial" w:hAnsi="Arial"/>
+          <w:sz w:val="22"/>
+        </w:rPr>
+        <w:t>Snapshot data portability — the 228 MB equity snapshot is currently single-source on Mike's machine; should be backed up to R2 or regeneratable</w:t>
+      </w:r>
+    </w:p>
+    <w:p>
+      <w:pPr>
+        <w:pStyle w:val="ListBullet"/>
+      </w:pPr>
+      <w:r>
+        <w:rPr>
+          <w:rFonts w:ascii="Arial" w:hAnsi="Arial"/>
+          <w:sz w:val="22"/>
+        </w:rPr>
+        <w:t>Documented hardware-aware task routing for CUDA-required work on Chris's RTX 5080</w:t>
+      </w:r>
+    </w:p>
+    <w:p>
+      <w:r>
+        <w:rPr>
+          <w:rFonts w:ascii="Arial" w:hAnsi="Arial"/>
+          <w:b w:val="0"/>
+          <w:i w:val="0"/>
+          <w:sz w:val="22"/>
+        </w:rPr>
+        <w:t>See docs/future_work.md ("Two-workstation parity for cross-contributor handoff") for the multi-phase plan and per-phase cost estimates.</w:t>
       </w:r>
     </w:p>
     <w:p>
@@ -4136,7 +4276,31 @@
                 <w:rFonts w:ascii="Consolas" w:hAnsi="Consolas"/>
                 <w:sz w:val="18"/>
               </w:rPr>
-              <w:t># 1. Install missing dependencies</w:t>
+              <w:t># Post-PR-#15-merge action sequence (most URGENT items done</w:t>
+            </w:r>
+          </w:p>
+          <w:p>
+            <w:pPr>
+              <w:spacing w:after="0" w:before="0"/>
+            </w:pPr>
+            <w:r>
+              <w:rPr>
+                <w:rFonts w:ascii="Consolas" w:hAnsi="Consolas"/>
+                <w:sz w:val="18"/>
+              </w:rPr>
+              <w:t># 2026-05-11; remaining items pending Chris's v1 study output).</w:t>
+            </w:r>
+          </w:p>
+          <w:p>
+            <w:pPr>
+              <w:spacing w:after="0" w:before="0"/>
+            </w:pPr>
+            <w:r>
+              <w:rPr>
+                <w:rFonts w:ascii="Consolas" w:hAnsi="Consolas"/>
+                <w:sz w:val="18"/>
+              </w:rPr>
+              <w:t xml:space="preserve"> </w:t>
             </w:r>
           </w:p>
           <w:p>
@@ -4160,18 +4324,6 @@
                 <w:rFonts w:ascii="Consolas" w:hAnsi="Consolas"/>
                 <w:sz w:val="18"/>
               </w:rPr>
-              <w:t>venv\Scripts\pip install -r requirements.txt</w:t>
-            </w:r>
-          </w:p>
-          <w:p>
-            <w:pPr>
-              <w:spacing w:after="0" w:before="0"/>
-            </w:pPr>
-            <w:r>
-              <w:rPr>
-                <w:rFonts w:ascii="Consolas" w:hAnsi="Consolas"/>
-                <w:sz w:val="18"/>
-              </w:rPr>
               <w:t xml:space="preserve"> </w:t>
             </w:r>
           </w:p>
@@ -4184,7 +4336,7 @@
                 <w:rFonts w:ascii="Consolas" w:hAnsi="Consolas"/>
                 <w:sz w:val="18"/>
               </w:rPr>
-              <w:t># 2. After PR #15 merges, pull main</w:t>
+              <w:t># 1. Confirm local main is current</w:t>
             </w:r>
           </w:p>
           <w:p>
@@ -4232,7 +4384,7 @@
                 <w:rFonts w:ascii="Consolas" w:hAnsi="Consolas"/>
                 <w:sz w:val="18"/>
               </w:rPr>
-              <w:t># 3. Sync R2 for both asset classes</w:t>
+              <w:t># 2. (Chris) Launch the v1 production study. ~6h runtime.</w:t>
             </w:r>
           </w:p>
           <w:p>
@@ -4244,19 +4396,7 @@
                 <w:rFonts w:ascii="Consolas" w:hAnsi="Consolas"/>
                 <w:sz w:val="18"/>
               </w:rPr>
-              <w:t>venv\Scripts\python.exe src\snapshot_for_cloud.py --asset-class equities --dry-run</w:t>
-            </w:r>
-          </w:p>
-          <w:p>
-            <w:pPr>
-              <w:spacing w:after="0" w:before="0"/>
-            </w:pPr>
-            <w:r>
-              <w:rPr>
-                <w:rFonts w:ascii="Consolas" w:hAnsi="Consolas"/>
-                <w:sz w:val="18"/>
-              </w:rPr>
-              <w:t>venv\Scripts\python.exe src\snapshot_for_cloud.py --asset-class equities</w:t>
+              <w:t>venv\Scripts\python.exe scripts\run_options_v1_study.py</w:t>
             </w:r>
           </w:p>
           <w:p>
@@ -4269,6 +4409,30 @@
                 <w:sz w:val="18"/>
               </w:rPr>
               <w:t xml:space="preserve"> </w:t>
+            </w:r>
+          </w:p>
+          <w:p>
+            <w:pPr>
+              <w:spacing w:after="0" w:before="0"/>
+            </w:pPr>
+            <w:r>
+              <w:rPr>
+                <w:rFonts w:ascii="Consolas" w:hAnsi="Consolas"/>
+                <w:sz w:val="18"/>
+              </w:rPr>
+              <w:t># 3. After v1 study completes, sync options R2 (first-ever</w:t>
+            </w:r>
+          </w:p>
+          <w:p>
+            <w:pPr>
+              <w:spacing w:after="0" w:before="0"/>
+            </w:pPr>
+            <w:r>
+              <w:rPr>
+                <w:rFonts w:ascii="Consolas" w:hAnsi="Consolas"/>
+                <w:sz w:val="18"/>
+              </w:rPr>
+              <w:t>#    options upload). --dry-run first.</w:t>
             </w:r>
           </w:p>
           <w:p>
@@ -4328,7 +4492,7 @@
                 <w:rFonts w:ascii="Consolas" w:hAnsi="Consolas"/>
                 <w:sz w:val="18"/>
               </w:rPr>
-              <w:t>#    Click each tab. Verify no errors. Verify Options tab shows</w:t>
+              <w:t>#    Click each tab. Verify Options tab shows real content</w:t>
             </w:r>
           </w:p>
           <w:p>
@@ -4340,7 +4504,7 @@
                 <w:rFonts w:ascii="Consolas" w:hAnsi="Consolas"/>
                 <w:sz w:val="18"/>
               </w:rPr>
-              <w:t>#    real content instead of placeholder.</w:t>
+              <w:t>#    instead of placeholder.</w:t>
             </w:r>
           </w:p>
           <w:p>
@@ -4364,7 +4528,7 @@
                 <w:rFonts w:ascii="Consolas" w:hAnsi="Consolas"/>
                 <w:sz w:val="18"/>
               </w:rPr>
-              <w:t># 5. Run pytest to confirm all tests pass</w:t>
+              <w:t># 5. Run pytest to confirm all tests still pass</w:t>
             </w:r>
           </w:p>
           <w:p>
@@ -4836,7 +5000,7 @@
                 <w:rFonts w:ascii="Consolas" w:hAnsi="Consolas"/>
                 <w:sz w:val="18"/>
               </w:rPr>
-              <w:t>chris/options-fix-v1-study-hang            # 7e0881c (1 ahead, OPEN PR #15)</w:t>
+              <w:t xml:space="preserve">                                           # (PR #15 merged 2026-05-11 at 993527f)</w:t>
             </w:r>
           </w:p>
           <w:p>
@@ -4907,6 +5071,26 @@
           <w:sz w:val="22"/>
         </w:rPr>
         <w:t>This is the canonical project state doc. It supersedes prior versions and is committed to the repo for the first time.</w:t>
+      </w:r>
+    </w:p>
+    <w:p>
+      <w:r>
+        <w:rPr>
+          <w:rFonts w:ascii="Arial" w:hAnsi="Arial"/>
+          <w:b/>
+          <w:i w:val="0"/>
+          <w:sz w:val="22"/>
+        </w:rPr>
+        <w:t xml:space="preserve">Last updated: </w:t>
+      </w:r>
+      <w:r>
+        <w:rPr>
+          <w:rFonts w:ascii="Arial" w:hAnsi="Arial"/>
+          <w:b w:val="0"/>
+          <w:i w:val="0"/>
+          <w:sz w:val="22"/>
+        </w:rPr>
+        <w:t>2026-05-11 (post-PR-#15-merge refresh — URGENT items cleared, .env.example completed, workstation-parity goal added).</w:t>
       </w:r>
     </w:p>
     <w:tbl>
@@ -5852,6 +6036,86 @@
         <w:t>The !docs/*.docx gitignore rule was buggy and had been silently dropping any docx file under docs/specs/ for weeks. The fix means committed documentation now reliably lands in the repo.</w:t>
       </w:r>
     </w:p>
+    <w:p>
+      <w:pPr>
+        <w:pStyle w:val="Heading2"/>
+      </w:pPr>
+      <w:r>
+        <w:t>2026-05-11 (later in day) — Post-merge sweep</w:t>
+      </w:r>
+    </w:p>
+    <w:p>
+      <w:pPr>
+        <w:pStyle w:val="ListBullet"/>
+      </w:pPr>
+      <w:r>
+        <w:rPr>
+          <w:rFonts w:ascii="Arial" w:hAnsi="Arial"/>
+          <w:sz w:val="22"/>
+        </w:rPr>
+        <w:t>PR #15 merged (commit 993527f)</w:t>
+      </w:r>
+    </w:p>
+    <w:p>
+      <w:pPr>
+        <w:pStyle w:val="ListBullet"/>
+      </w:pPr>
+      <w:r>
+        <w:rPr>
+          <w:rFonts w:ascii="Arial" w:hAnsi="Arial"/>
+          <w:sz w:val="22"/>
+        </w:rPr>
+        <w:t>R2 synced for equities at the new HEAD</w:t>
+      </w:r>
+    </w:p>
+    <w:p>
+      <w:pPr>
+        <w:pStyle w:val="ListBullet"/>
+      </w:pPr>
+      <w:r>
+        <w:rPr>
+          <w:rFonts w:ascii="Arial" w:hAnsi="Arial"/>
+          <w:sz w:val="22"/>
+        </w:rPr>
+        <w:t>Test collection bug fixed (commit c1346cd)</w:t>
+      </w:r>
+    </w:p>
+    <w:p>
+      <w:pPr>
+        <w:pStyle w:val="ListBullet"/>
+      </w:pPr>
+      <w:r>
+        <w:rPr>
+          <w:rFonts w:ascii="Arial" w:hAnsi="Arial"/>
+          <w:sz w:val="22"/>
+        </w:rPr>
+        <w:t>Venv dependencies installed (pip install -r requirements.txt)</w:t>
+      </w:r>
+    </w:p>
+    <w:p>
+      <w:pPr>
+        <w:pStyle w:val="ListBullet"/>
+      </w:pPr>
+      <w:r>
+        <w:rPr>
+          <w:rFonts w:ascii="Arial" w:hAnsi="Arial"/>
+          <w:sz w:val="22"/>
+        </w:rPr>
+        <w:t>.env.example completed with all required keys (Tradier, Polygon, FRED, Finnhub, R2, optional PAPER_TRADER_* runtime knobs)</w:t>
+      </w:r>
+    </w:p>
+    <w:p>
+      <w:pPr>
+        <w:pStyle w:val="ListBullet"/>
+      </w:pPr>
+      <w:r>
+        <w:rPr>
+          <w:rFonts w:ascii="Arial" w:hAnsi="Arial"/>
+          <w:sz w:val="22"/>
+        </w:rPr>
+        <w:t>URGENT block of action items cleared; next URGENT surfaces when Chris launches the v1 production study</w:t>
+      </w:r>
+    </w:p>
     <w:sectPr>
       <w:pgSz w:w="12240" w:h="15840"/>
       <w:pgMar w:top="1440" w:right="1440" w:bottom="1440" w:left="1440" w:header="720" w:footer="720" w:gutter="0"/>

</xml_diff>

<commit_message>
feat(equities): Larger Universe v1 snapshot — Finnhub + yfinance hybrid
- Add Finnhub Basic fetcher (prices, fundamentals) with rate-limiting
- Add Wikipedia-based universe builder with SEC CIK disambiguation
- Apply stash@{0} (yfinance earnings retry + sanity gate)
- Promote snapshot to models/snapshots/equities/larger_universe_v1_20260511/
- Coverage: 92.5% prices, 90.4% fundamentals across 2,122 tickers
- earnings_dates dropped from v1 (yfinance sanity gate fired at 23.6%)
- OTC-tail truncation working: SIVB/BBBY clipped at Wikipedia removed_at
- Tracker Section 3 (Polygon piggyback) marked OBSOLETE
- Redact ?token=... from logged HTTP errors (was leaking the Finnhub
  key into Phase 3 log + summary JSON via requests.HTTPError formatting)
- 15 equity tests passing

See docs/diagnostics/larger_universe_v1_snapshot_summary.md for full breakdown.

Co-Authored-By: Claude Opus 4.7 (1M context) <noreply@anthropic.com>
</commit_message>
<xml_diff>
--- a/docs/Project_State_Tracker.docx
+++ b/docs/Project_State_Tracker.docx
@@ -2826,6 +2826,12 @@
       </w:r>
     </w:p>
     <w:p>
+      <w:pPr/>
+      <w:r>
+        <w:t>OBSOLETE (2026-05-11): This analysis is superseded. Chris's Polygon subscription is options-only with a 2-year history limit and cannot be repurposed for stocks-side equity data. Mike instead purchased Finnhub Basic ($49.99/mo, 150 calls/min for candle, 60 calls/min for /stock/metric, 10y daily OHLC, survivorship-bias-mitigated). The Larger Universe v1 snapshot at models/snapshots/equities/larger_universe_v1_20260511/ is the result. See docs/diagnostics/larger_universe_v1_capabilities.md and docs/diagnostics/larger_universe_v1_snapshot_summary.md for details. The remainder of this section is preserved as historical record of the decision context.</w:t>
+      </w:r>
+    </w:p>
+    <w:p>
       <w:r>
         <w:rPr>
           <w:rFonts w:ascii="Arial" w:hAnsi="Arial"/>
@@ -4952,6 +4958,26 @@
         <w:t>Branch states</w:t>
       </w:r>
     </w:p>
+    <w:p>
+      <w:pPr>
+        <w:pStyle w:val="Heading2"/>
+      </w:pPr>
+      <w:r>
+        <w:t>Equity snapshots — Larger Universe v1 added 2026-05-11</w:t>
+      </w:r>
+    </w:p>
+    <w:p>
+      <w:pPr/>
+      <w:r>
+        <w:t>models/snapshots/equities/pre_v2_20260505/  — legacy baseline (locked). 491 ticker universe (SP500 + NDX overlap), 2018-01-02 onward, survivorship-biased. Used by the three promoted studies (#325, #842, #1852). Do not modify.</w:t>
+      </w:r>
+    </w:p>
+    <w:p>
+      <w:pPr/>
+      <w:r>
+        <w:t>models/snapshots/equities/larger_universe_v1_20260511/  — Larger Universe v1 baseline (best-effort survivorship-bias mitigation, fresh study material). 1,963 tickers with 10y daily prices, 1,919 with Finnhub fundamentals, macro_signals carried forward. SP500 + SP400 + SP600 actives plus last-decade delisted. No earnings_dates (Finnhub Basic forward-only; yfinance scale-fetch hit 23.6% coverage and the stash sanity gate fired — feature dropped from v1 per the &lt;85% rule). See the snapshot summary doc for the full coverage breakdown and residual-bias characterization.</w:t>
+      </w:r>
+    </w:p>
     <w:tbl>
       <w:tblPr>
         <w:tblW w:type="auto" w:w="0"/>

</xml_diff>

<commit_message>
docs: add Operating Principles section to tracker
Canonical project guidance inserted between the Executive Summary and the
Claude Session Onboarding section. Covers project goal (deployable equity
strategy, not just methodology documentation), decision criteria (accuracy
→ relevance → goal-directedness), what's ruled in/out, methodology
principles operating from v1 (phased gates, pre-committed criteria, dashboard
as primary deliverable, honest framing of mixed results, on-demand sanity
checking, top-quintile CV objective, reserved validation windows), and
guidance for partners working with Claude instances.

Rides along with v2 to main at Gate 5 merge.

Co-Authored-By: Claude Opus 4.7 (1M context) <noreply@anthropic.com>
</commit_message>
<xml_diff>
--- a/docs/Project_State_Tracker.docx
+++ b/docs/Project_State_Tracker.docx
@@ -1345,6 +1345,353 @@
         <w:pStyle w:val="Heading1"/>
       </w:pPr>
       <w:r>
+        <w:t>Operating Principles</w:t>
+      </w:r>
+    </w:p>
+    <w:p>
+      <w:pPr/>
+      <w:r>
+        <w:rPr>
+          <w:i/>
+        </w:rPr>
+        <w:t>Status: canonical for this project as of 2026-05-12. All partners and any Claude instance operating in this project work from these principles.</w:t>
+      </w:r>
+    </w:p>
+    <w:p>
+      <w:pPr>
+        <w:pStyle w:val="Heading2"/>
+      </w:pPr>
+      <w:r>
+        <w:t>Project goal</w:t>
+      </w:r>
+    </w:p>
+    <w:p>
+      <w:pPr/>
+      <w:r>
+        <w:t>Build a deployable equity strategy that produces excess returns versus SPY in production. The eventual output is an algorithm running with real capital, not a study that documents methodology. Every decision should be evaluated against whether it advances this goal.</w:t>
+      </w:r>
+    </w:p>
+    <w:p>
+      <w:pPr/>
+      <w:r>
+        <w:t>This is a long-horizon goal. Individual studies (v1, v2, etc.) are stepping stones; promotion of a strategy to deployment requires meeting all pre-committed success criteria including drawdown, concentration, and risk-adjusted return thresholds. Documenting failures honestly is part of the path forward, but documentation is not the destination — the destination is a strategy in production.</w:t>
+      </w:r>
+    </w:p>
+    <w:p>
+      <w:pPr>
+        <w:pStyle w:val="Heading2"/>
+      </w:pPr>
+      <w:r>
+        <w:t>Decision principles</w:t>
+      </w:r>
+    </w:p>
+    <w:p>
+      <w:pPr/>
+      <w:r>
+        <w:t>Decisions in this project are evaluated against three criteria, in this order:</w:t>
+      </w:r>
+    </w:p>
+    <w:p>
+      <w:pPr>
+        <w:pStyle w:val="ListBullet"/>
+      </w:pPr>
+      <w:r>
+        <w:rPr>
+          <w:b/>
+        </w:rPr>
+        <w:t>1. Accuracy.</w:t>
+      </w:r>
+      <w:r>
+        <w:t xml:space="preserve"> Does this produce correct, honest, defensible results? Are methodology choices grounded in evidence rather than convenience? Are success criteria meaningful rather than trivially clearable?</w:t>
+      </w:r>
+    </w:p>
+    <w:p>
+      <w:pPr>
+        <w:pStyle w:val="ListBullet"/>
+      </w:pPr>
+      <w:r>
+        <w:rPr>
+          <w:b/>
+        </w:rPr>
+        <w:t>2. Relevance.</w:t>
+      </w:r>
+      <w:r>
+        <w:t xml:space="preserve"> Does this work contribute to the eventual deployable algorithm, or is it incidental scaffolding that feels productive but doesn't move toward shipping? Methodology findings have diminishing returns; at some point we need to surface answers that work, not just better understanding of why things don't work.</w:t>
+      </w:r>
+    </w:p>
+    <w:p>
+      <w:pPr>
+        <w:pStyle w:val="ListBullet"/>
+      </w:pPr>
+      <w:r>
+        <w:rPr>
+          <w:b/>
+        </w:rPr>
+        <w:t>3. Goal-directedness.</w:t>
+      </w:r>
+      <w:r>
+        <w:t xml:space="preserve"> Does this get us closer to a strategy in production? Not in backtesting, not in walk-forward analysis, not on paper — in actual deployment where real money is at risk.</w:t>
+      </w:r>
+    </w:p>
+    <w:p>
+      <w:pPr>
+        <w:pStyle w:val="Heading2"/>
+      </w:pPr>
+      <w:r>
+        <w:t>What this rules out</w:t>
+      </w:r>
+    </w:p>
+    <w:p>
+      <w:pPr>
+        <w:pStyle w:val="ListBullet"/>
+      </w:pPr>
+      <w:r>
+        <w:t>Time-based reasoning. "This would take a while" is not a valid argument against doing accurate, relevant, goal-aligned work. If it advances the goal, do it.</w:t>
+      </w:r>
+    </w:p>
+    <w:p>
+      <w:pPr>
+        <w:pStyle w:val="ListBullet"/>
+      </w:pPr>
+      <w:r>
+        <w:t>Convenience-based methodology choices. "Let's use the simpler metric because it's easier" is invalid if the simpler metric is less accurate.</w:t>
+      </w:r>
+    </w:p>
+    <w:p>
+      <w:pPr>
+        <w:pStyle w:val="ListBullet"/>
+      </w:pPr>
+      <w:r>
+        <w:t>Goalpost-moving. Success criteria pre-committed before a study runs are binding. Post-hoc adjustment of criteria to make a result look better than it is violates accuracy.</w:t>
+      </w:r>
+    </w:p>
+    <w:p>
+      <w:pPr>
+        <w:pStyle w:val="ListBullet"/>
+      </w:pPr>
+      <w:r>
+        <w:t>Methodology findings as substitutes for working strategies. Surfacing "we learned why this doesn't work" is valuable but doesn't constitute progress toward deployment.</w:t>
+      </w:r>
+    </w:p>
+    <w:p>
+      <w:pPr>
+        <w:pStyle w:val="Heading2"/>
+      </w:pPr>
+      <w:r>
+        <w:t>What this rules in</w:t>
+      </w:r>
+    </w:p>
+    <w:p>
+      <w:pPr>
+        <w:pStyle w:val="ListBullet"/>
+      </w:pPr>
+      <w:r>
+        <w:t>Pre-committed success criteria before any study runs. Quantitative, evaluated on appropriate time windows, applied uniformly.</w:t>
+      </w:r>
+    </w:p>
+    <w:p>
+      <w:pPr>
+        <w:pStyle w:val="ListBullet"/>
+      </w:pPr>
+      <w:r>
+        <w:t>Honest framing of mixed results. "Not promoted" is the correct outcome when criteria aren't met, regardless of how much work went into the study.</w:t>
+      </w:r>
+    </w:p>
+    <w:p>
+      <w:pPr>
+        <w:pStyle w:val="ListBullet"/>
+      </w:pPr>
+      <w:r>
+        <w:t>Methodology rigor that catches errors before they propagate. Phased gates, smoke tests, intermediate diagnostics before expensive compute.</w:t>
+      </w:r>
+    </w:p>
+    <w:p>
+      <w:pPr>
+        <w:pStyle w:val="ListBullet"/>
+      </w:pPr>
+      <w:r>
+        <w:t>Architectural memos when a study surfaces a methodology choice that affects future studies. These are how findings become institutional knowledge rather than oral tradition.</w:t>
+      </w:r>
+    </w:p>
+    <w:p>
+      <w:pPr>
+        <w:pStyle w:val="Heading2"/>
+      </w:pPr>
+      <w:r>
+        <w:t>Methodology principles we operate from</w:t>
+      </w:r>
+    </w:p>
+    <w:p>
+      <w:pPr/>
+      <w:r>
+        <w:t xml:space="preserve">These are derived from v1's experience and codified in architectural memos at </w:t>
+      </w:r>
+      <w:r>
+        <w:t>docs/architecture/</w:t>
+      </w:r>
+      <w:r>
+        <w:t>. New partners should read the memos themselves; this is a summary for context.</w:t>
+      </w:r>
+    </w:p>
+    <w:p>
+      <w:pPr/>
+      <w:r>
+        <w:rPr>
+          <w:i/>
+        </w:rPr>
+        <w:t>Phased work with mandatory gates.</w:t>
+      </w:r>
+      <w:r>
+        <w:t xml:space="preserve"> Studies are broken into phases (data preparation → model design → tuning → backtest → analysis → writeup) with explicit gates between phases. Each gate produces a report; work doesn't proceed without explicit approval. Rationale: catches errors when they're cheap to fix rather than after they've propagated through the rest of the work.</w:t>
+      </w:r>
+    </w:p>
+    <w:p>
+      <w:pPr/>
+      <w:r>
+        <w:rPr>
+          <w:i/>
+        </w:rPr>
+        <w:t>Pre-committed success criteria.</w:t>
+      </w:r>
+      <w:r>
+        <w:t xml:space="preserve"> Before any study runs, the criteria for success are specified quantitatively, on appropriate evaluation windows, with thresholds chosen ex ante. A study either meets these criteria or it doesn't; the criteria are not adjusted post-hoc to fit results.</w:t>
+      </w:r>
+    </w:p>
+    <w:p>
+      <w:pPr/>
+      <w:r>
+        <w:rPr>
+          <w:i/>
+        </w:rPr>
+        <w:t>Dashboard as primary deliverable.</w:t>
+      </w:r>
+      <w:r>
+        <w:t xml:space="preserve"> Partners and external reviewers interact with results through the dashboard, not through writeups. The dashboard renders the data; the writeup is supplementary narrative. This shapes implementation priority — the dashboard contract must support each study's analytical needs, and dashboard rendering quality matters more than writeup polish.</w:t>
+      </w:r>
+    </w:p>
+    <w:p>
+      <w:pPr/>
+      <w:r>
+        <w:rPr>
+          <w:i/>
+        </w:rPr>
+        <w:t>Honest framing of mixed results.</w:t>
+      </w:r>
+      <w:r>
+        <w:t xml:space="preserve"> When a study fails promotion criteria, the result is documented as failure, not reframed as success. This is the discipline that makes the project's record trustworthy.</w:t>
+      </w:r>
+    </w:p>
+    <w:p>
+      <w:pPr/>
+      <w:r>
+        <w:rPr>
+          <w:i/>
+        </w:rPr>
+        <w:t>On-demand sanity checking.</w:t>
+      </w:r>
+      <w:r>
+        <w:t xml:space="preserve"> Sanity-check models (alternative model classes) are run on-demand when a primary-model result is strong enough to warrant scrutiny, not as default parallel runs. Triggers and discipline guardrails are in </w:t>
+      </w:r>
+      <w:r>
+        <w:t>docs/architecture/sanity_check_methodology_v1.md</w:t>
+      </w:r>
+      <w:r>
+        <w:t>.</w:t>
+      </w:r>
+    </w:p>
+    <w:p>
+      <w:pPr/>
+      <w:r>
+        <w:rPr>
+          <w:i/>
+        </w:rPr>
+        <w:t>Top-quintile CV objective for top-N strategies.</w:t>
+      </w:r>
+      <w:r>
+        <w:t xml:space="preserve"> ML studies that build top-N portfolios use top-quintile Spearman IC as the primary CV objective, with full-cross-section IC reported alongside for comparison. Rationale in </w:t>
+      </w:r>
+      <w:r>
+        <w:t>docs/architecture/ml_study_cv_objectives_v1.md</w:t>
+      </w:r>
+      <w:r>
+        <w:t>.</w:t>
+      </w:r>
+    </w:p>
+    <w:p>
+      <w:pPr/>
+      <w:r>
+        <w:rPr>
+          <w:i/>
+        </w:rPr>
+        <w:t>Reserved validation periods stay reserved.</w:t>
+      </w:r>
+      <w:r>
+        <w:t xml:space="preserve"> Studies have a final hold-out window that is deliberately not analyzed during the study itself, only examined at the writeup stage as an independent generalization check. The distinction between "test window" (analyzed) and "reserved validation window" (untouched until final) is methodological, not just nomenclature.</w:t>
+      </w:r>
+    </w:p>
+    <w:p>
+      <w:pPr>
+        <w:pStyle w:val="Heading2"/>
+      </w:pPr>
+      <w:r>
+        <w:t>Working with Claude instances on this project</w:t>
+      </w:r>
+    </w:p>
+    <w:p>
+      <w:pPr/>
+      <w:r>
+        <w:t>Any partner using Claude (either claude.ai or Claude Code) should ensure their Claude instance is operating from these principles. Specifically:</w:t>
+      </w:r>
+    </w:p>
+    <w:p>
+      <w:pPr>
+        <w:pStyle w:val="ListBullet"/>
+      </w:pPr>
+      <w:r>
+        <w:t>Reject time-based arguments. If a Claude instance suggests deferring work because it would take a while, or proposes a simpler approach because it's faster, that's grounds to push back. The principles above don't include time as a decision input.</w:t>
+      </w:r>
+    </w:p>
+    <w:p>
+      <w:pPr>
+        <w:pStyle w:val="ListBullet"/>
+      </w:pPr>
+      <w:r>
+        <w:t>Expect honest framing. Claude should call out methodological concerns, push back when proposed framings drift from what evidence supports, and not soften results to make them sound better than they are.</w:t>
+      </w:r>
+    </w:p>
+    <w:p>
+      <w:pPr>
+        <w:pStyle w:val="ListBullet"/>
+      </w:pPr>
+      <w:r>
+        <w:t xml:space="preserve">Verify against architectural memos. When designing new studies or proposing methodology changes, the architectural memos in </w:t>
+      </w:r>
+      <w:r>
+        <w:t>docs/architecture/</w:t>
+      </w:r>
+      <w:r>
+        <w:t xml:space="preserve"> are canonical. New Claude instances should read them, not re-derive their findings.</w:t>
+      </w:r>
+    </w:p>
+    <w:p>
+      <w:pPr>
+        <w:pStyle w:val="ListBullet"/>
+      </w:pPr>
+      <w:r>
+        <w:t>Maintain the gate discipline. Phased work with mandatory stop-and-report gates is the discipline that catches errors. Claude instances should propose appropriate gates for new work, not skip them for momentum.</w:t>
+      </w:r>
+    </w:p>
+    <w:p>
+      <w:pPr/>
+      <w:r>
+        <w:t>When a Claude instance shows signs of drifting from these principles (rushing through gates, softening results, time-based reasoning, treating methodology findings as substitutes for working strategies), push back. The principles are load-bearing; the project's track record depends on holding them.</w:t>
+      </w:r>
+    </w:p>
+    <w:p>
+      <w:pPr>
+        <w:pStyle w:val="Heading1"/>
+      </w:pPr>
+      <w:r>
         <w:t>Claude Session Onboarding</w:t>
       </w:r>
     </w:p>

</xml_diff>